<commit_message>
chore: remove lab checkpoints and rejoin steps
Each lab folder now holds only its instruction PDF, the lab workbook
and the templates that lab uses. The checkpoints folders, the
"Checkpoint" PDF section and every rejoin instruction are removed;
labs that build on earlier work use the learner's own outputs.

Co-Authored-By: Claude Opus 5.5 <noreply@anthropic.com>
</commit_message>
<xml_diff>
--- a/courseware/LG-GenAI for Engineers.docx
+++ b/courseware/LG-GenAI for Engineers.docx
@@ -759,7 +759,7 @@
         </w:rPr>
         <w:t>Lab 2 · Word to PowerPoint and Outlook — Create the Cross-App Maintenance Update</w:t>
         <w:tab/>
-        <w:t>16</w:t>
+        <w:t>15</w:t>
       </w:r>
     </w:p>
     <w:p>
@@ -798,7 +798,7 @@
         </w:rPr>
         <w:t>Topic 2 — Personalisation, .Rules and Skills for Excel</w:t>
         <w:tab/>
-        <w:t>20</w:t>
+        <w:t>19</w:t>
       </w:r>
     </w:p>
     <w:p>
@@ -818,7 +818,7 @@
         </w:rPr>
         <w:t>Account Personalisation and Specific Requests</w:t>
         <w:tab/>
-        <w:t>20</w:t>
+        <w:t>19</w:t>
       </w:r>
     </w:p>
     <w:p>
@@ -838,7 +838,7 @@
         </w:rPr>
         <w:t>Lab 3 · Personalisation — Personalise Copilot in Excel for Consistent Service Reports</w:t>
         <w:tab/>
-        <w:t>21</w:t>
+        <w:t>20</w:t>
       </w:r>
     </w:p>
     <w:p>
@@ -858,7 +858,7 @@
         </w:rPr>
         <w:t>Visible Workbook .Rules and Formula Results</w:t>
         <w:tab/>
-        <w:t>24</w:t>
+        <w:t>23</w:t>
       </w:r>
     </w:p>
     <w:p>
@@ -878,7 +878,7 @@
         </w:rPr>
         <w:t>Lab 4 · Workbook .Rules — Create and Test Workbook .Rules for Water Service Reporting</w:t>
         <w:tab/>
-        <w:t>25</w:t>
+        <w:t>24</w:t>
       </w:r>
     </w:p>
     <w:p>
@@ -898,7 +898,7 @@
         </w:rPr>
         <w:t>Built-in and Custom Skills</w:t>
         <w:tab/>
-        <w:t>30</w:t>
+        <w:t>29</w:t>
       </w:r>
     </w:p>
     <w:p>
@@ -918,7 +918,7 @@
         </w:rPr>
         <w:t>Pareto Skill: Counts, Sorting and Cumulative Share</w:t>
         <w:tab/>
-        <w:t>31</w:t>
+        <w:t>30</w:t>
       </w:r>
     </w:p>
     <w:p>
@@ -938,7 +938,7 @@
         </w:rPr>
         <w:t>Lab 5 · Custom Pareto Chart Skill — Use the Built-in Chart Skill, then Create a Custom Pareto Skill</w:t>
         <w:tab/>
-        <w:t>32</w:t>
+        <w:t>31</w:t>
       </w:r>
     </w:p>
     <w:p>
@@ -958,7 +958,7 @@
         </w:rPr>
         <w:t>Skills, Prompts and Workbook Rules</w:t>
         <w:tab/>
-        <w:t>37</w:t>
+        <w:t>36</w:t>
       </w:r>
     </w:p>
     <w:p>
@@ -978,7 +978,7 @@
         </w:rPr>
         <w:t>Custom Skill Discovery in Each App</w:t>
         <w:tab/>
-        <w:t>38</w:t>
+        <w:t>37</w:t>
       </w:r>
     </w:p>
     <w:p>
@@ -998,7 +998,7 @@
         </w:rPr>
         <w:t>Repeatability and Safe Skill Reruns</w:t>
         <w:tab/>
-        <w:t>39</w:t>
+        <w:t>37</w:t>
       </w:r>
     </w:p>
     <w:p>
@@ -1018,7 +1018,7 @@
         </w:rPr>
         <w:t>Assignment Proposals and Capacity Evidence</w:t>
         <w:tab/>
-        <w:t>40</w:t>
+        <w:t>38</w:t>
       </w:r>
     </w:p>
     <w:p>
@@ -1038,7 +1038,7 @@
         </w:rPr>
         <w:t>Lab 6 · Reporting Skill — Create, Use and Improve the Maintenance Reporting Skill</w:t>
         <w:tab/>
-        <w:t>40</w:t>
+        <w:t>39</w:t>
       </w:r>
     </w:p>
     <w:p>
@@ -1058,7 +1058,7 @@
         </w:rPr>
         <w:t>Topic 2 Recap - Mapped to Learning Outcomes</w:t>
         <w:tab/>
-        <w:t>45</w:t>
+        <w:t>44</w:t>
       </w:r>
     </w:p>
     <w:p>
@@ -1077,7 +1077,7 @@
         </w:rPr>
         <w:t>Topic 3 — Interactive Dashboards with Custom Skills</w:t>
         <w:tab/>
-        <w:t>45</w:t>
+        <w:t>44</w:t>
       </w:r>
     </w:p>
     <w:p>
@@ -1097,7 +1097,7 @@
         </w:rPr>
         <w:t>Custom Dashboard Skill as a Reusable Contract</w:t>
         <w:tab/>
-        <w:t>45</w:t>
+        <w:t>44</w:t>
       </w:r>
     </w:p>
     <w:p>
@@ -1117,7 +1117,7 @@
         </w:rPr>
         <w:t>Dashboard Measures and Denominators</w:t>
         <w:tab/>
-        <w:t>46</w:t>
+        <w:t>45</w:t>
       </w:r>
     </w:p>
     <w:p>
@@ -1137,7 +1137,7 @@
         </w:rPr>
         <w:t>Visual Dashboard Design for Maintenance</w:t>
         <w:tab/>
-        <w:t>47</w:t>
+        <w:t>46</w:t>
       </w:r>
     </w:p>
     <w:p>
@@ -1157,7 +1157,7 @@
         </w:rPr>
         <w:t>Lab 7 · Custom Dashboard Skill — Create and Apply a Custom Interactive Dashboard Skill</w:t>
         <w:tab/>
-        <w:t>48</w:t>
+        <w:t>47</w:t>
       </w:r>
     </w:p>
     <w:p>
@@ -1177,7 +1177,7 @@
         </w:rPr>
         <w:t>One Filter Scope for Every Visual</w:t>
         <w:tab/>
-        <w:t>52</w:t>
+        <w:t>51</w:t>
       </w:r>
     </w:p>
     <w:p>
@@ -1197,7 +1197,7 @@
         </w:rPr>
         <w:t>Refresh Tests and Static Snapshots</w:t>
         <w:tab/>
-        <w:t>53</w:t>
+        <w:t>52</w:t>
       </w:r>
     </w:p>
     <w:p>
@@ -1217,7 +1217,7 @@
         </w:rPr>
         <w:t>Lab 8 · Interactive Filters and Refresh — Use the Dashboard Skill for Filters, Refresh and Safe Reruns</w:t>
         <w:tab/>
-        <w:t>54</w:t>
+        <w:t>53</w:t>
       </w:r>
     </w:p>
     <w:p>
@@ -1237,7 +1237,7 @@
         </w:rPr>
         <w:t>Topic 3 Recap - Mapped to Learning Outcomes</w:t>
         <w:tab/>
-        <w:t>59</w:t>
+        <w:t>58</w:t>
       </w:r>
     </w:p>
     <w:p>
@@ -1256,7 +1256,7 @@
         </w:rPr>
         <w:t>Topic 4 — Create a Professional Presentation with PowerPoint Copilot</w:t>
         <w:tab/>
-        <w:t>59</w:t>
+        <w:t>58</w:t>
       </w:r>
     </w:p>
     <w:p>
@@ -1276,7 +1276,7 @@
         </w:rPr>
         <w:t>From Dashboard Evidence to a Decision Story</w:t>
         <w:tab/>
-        <w:t>59</w:t>
+        <w:t>58</w:t>
       </w:r>
     </w:p>
     <w:p>
@@ -1296,7 +1296,7 @@
         </w:rPr>
         <w:t>Charts, Templates and Source Provenance</w:t>
         <w:tab/>
-        <w:t>60</w:t>
+        <w:t>59</w:t>
       </w:r>
     </w:p>
     <w:p>
@@ -1316,7 +1316,7 @@
         </w:rPr>
         <w:t>Lab 9 · Dashboard to presentation — Turn Dashboard Evidence into a Management Story</w:t>
         <w:tab/>
-        <w:t>61</w:t>
+        <w:t>60</w:t>
       </w:r>
     </w:p>
     <w:p>
@@ -1336,7 +1336,7 @@
         </w:rPr>
         <w:t>Professional Refinement and Rehearsal</w:t>
         <w:tab/>
-        <w:t>65</w:t>
+        <w:t>63</w:t>
       </w:r>
     </w:p>
     <w:p>
@@ -1356,7 +1356,7 @@
         </w:rPr>
         <w:t>Reviewed Handoff and Artifact Lifecycle</w:t>
         <w:tab/>
-        <w:t>66</w:t>
+        <w:t>64</w:t>
       </w:r>
     </w:p>
     <w:p>
@@ -1376,7 +1376,7 @@
         </w:rPr>
         <w:t>Lab 10 · Professional handoff — Refine and Present the Maintenance Decision Deck</w:t>
         <w:tab/>
-        <w:t>67</w:t>
+        <w:t>65</w:t>
       </w:r>
     </w:p>
     <w:p>
@@ -1396,7 +1396,7 @@
         </w:rPr>
         <w:t>Topic 4 Recap - Mapped to Learning Outcomes</w:t>
         <w:tab/>
-        <w:t>70</w:t>
+        <w:t>69</w:t>
       </w:r>
     </w:p>
     <w:p>
@@ -1415,7 +1415,7 @@
         </w:rPr>
         <w:t>Topic 5 — Copilot Agents and Mini Capstone</w:t>
         <w:tab/>
-        <w:t>71</w:t>
+        <w:t>69</w:t>
       </w:r>
     </w:p>
     <w:p>
@@ -1435,7 +1435,7 @@
         </w:rPr>
         <w:t>What Is Agent Builder?</w:t>
         <w:tab/>
-        <w:t>71</w:t>
+        <w:t>69</w:t>
       </w:r>
     </w:p>
     <w:p>
@@ -1455,7 +1455,7 @@
         </w:rPr>
         <w:t>Lab 11 · Copilot Agent Builder — Build a Work-Order Agent with Agent Builder</w:t>
         <w:tab/>
-        <w:t>72</w:t>
+        <w:t>70</w:t>
       </w:r>
     </w:p>
     <w:p>
@@ -1475,7 +1475,7 @@
         </w:rPr>
         <w:t>Mini Capstone: From Your Data to a Decision</w:t>
         <w:tab/>
-        <w:t>76</w:t>
+        <w:t>74</w:t>
       </w:r>
     </w:p>
     <w:p>
@@ -1495,7 +1495,7 @@
         </w:rPr>
         <w:t>Lab 12 · Mini Capstone — Mini Capstone: Group Dashboard and Decision Deck</w:t>
         <w:tab/>
-        <w:t>77</w:t>
+        <w:t>75</w:t>
       </w:r>
     </w:p>
     <w:p>
@@ -1515,7 +1515,7 @@
         </w:rPr>
         <w:t>Topic 5 Recap - Mapped to Learning Outcomes</w:t>
         <w:tab/>
-        <w:t>81</w:t>
+        <w:t>79</w:t>
       </w:r>
     </w:p>
     <w:p>
@@ -1534,7 +1534,7 @@
         </w:rPr>
         <w:t>Next Steps</w:t>
         <w:tab/>
-        <w:t>82</w:t>
+        <w:t>81</w:t>
       </w:r>
     </w:p>
     <w:p>
@@ -1553,7 +1553,7 @@
         </w:rPr>
         <w:t>Glossary</w:t>
         <w:tab/>
-        <w:t>82</w:t>
+        <w:t>81</w:t>
       </w:r>
     </w:p>
     <w:p>
@@ -1577,7 +1577,7 @@
     </w:p>
     <w:p>
       <w:r>
-        <w:t>Study each topic’s concepts before its connected labs. Topic 2 has four labs; Topics 1, 3 and 4 have two each; Topic 5 has the agent lab and the group mini capstone. Each lab has its own instruction PDF and a lean data folder: the lab workbook, only the templates that lab uses, and a rejoin checkpoint. Copy-ready prompts are on the linked web page, step by step. Carry your own verified outputs forward. A supplied checkpoint allows rejoining but is not evidence that you completed the earlier task. The detailed procedures are here and in labs; the slides teach concepts and show outcomes.</w:t>
+        <w:t>Study each topic’s concepts before its connected labs. Topic 2 has four labs; Topics 1, 3 and 4 have two each; Topic 5 has the agent lab and the group mini capstone. Each lab has its own instruction PDF and a lean data folder: the lab workbook and only the templates that lab uses. Copy-ready prompts are on the linked web page, step by step. Carry your own verified outputs forward. The detailed procedures are here and in labs; the slides teach concepts and show outcomes.</w:t>
       </w:r>
     </w:p>
     <w:p>
@@ -2629,7 +2629,7 @@
         <w:t xml:space="preserve">1.  </w:t>
       </w:r>
       <w:r>
-        <w:t>Copy data/Northstar_Work_Orders.xlsx to your OneDrive work-genai folder as Northstar_Clean_Work_Orders.xlsx. Open it in Excel, set Formulas &gt; Calculation Options &gt; Automatic, and read About_This_Data and Control. The workbook is the deliberately dirty 122-row input; the checkpoint workbook is a clean reference and must not replace the cleaning exercise. Open Copilot from Home &gt; Copilot.</w:t>
+        <w:t>Copy data/Northstar_Work_Orders.xlsx to your OneDrive work-genai folder as Northstar_Clean_Work_Orders.xlsx. Open it in Excel, set Formulas &gt; Calculation Options &gt; Automatic, and read About_This_Data and Control. The workbook is the deliberately dirty 122-row input. Open Copilot from Home &gt; Copilot.</w:t>
       </w:r>
     </w:p>
     <w:p>
@@ -3280,27 +3280,6 @@
           <w:color w:val="1F6FEB"/>
           <w:sz w:val="22"/>
         </w:rPr>
-        <w:t>Checkpoint and rejoin point</w:t>
-      </w:r>
-    </w:p>
-    <w:p>
-      <w:pPr>
-        <w:keepNext/>
-      </w:pPr>
-      <w:r>
-        <w:t>If you fell behind, use data/checkpoints/Northstar_Verified_Checkpoint.xlsx and data/checkpoints/Northstar_Verified_Snapshot.docx. Record checkpoint used in Prompt_Log; then perform this lab, rather than claiming the checkpoint as your output.</w:t>
-      </w:r>
-    </w:p>
-    <w:p>
-      <w:pPr>
-        <w:keepNext/>
-      </w:pPr>
-      <w:r>
-        <w:rPr>
-          <w:b/>
-          <w:color w:val="1F6FEB"/>
-          <w:sz w:val="22"/>
-        </w:rPr>
         <w:t>Troubleshooting</w:t>
       </w:r>
     </w:p>
@@ -3522,7 +3501,7 @@
         <w:rPr>
           <w:sz w:val="20"/>
         </w:rPr>
-        <w:t>The lab folder labs/lab-01-*/ holds the instruction PDF with sample prompts, a data folder with templates, checkpoints and the mock-data workbook (data/Northstar_Work_Orders.xlsx). Northstar Water Services is a fictional water-pipe maintenance and service company. All service hubs, staff and work orders are synthetic. Use the fixed reporting date 2026-09-30; missing facts remain UNKNOWN. Proposals do not change real assignments. Training email drafts are never sent.</w:t>
+        <w:t>The lab folder labs/lab-01-*/ holds the instruction PDF with sample prompts, a data folder with the lab workbook and any templates (data/Northstar_Work_Orders.xlsx). Northstar Water Services is a fictional water-pipe maintenance and service company. All service hubs, staff and work orders are synthetic. Use the fixed reporting date 2026-09-30; missing facts remain UNKNOWN. Proposals do not change real assignments. Training email drafts are never sent.</w:t>
       </w:r>
     </w:p>
     <w:p/>
@@ -4332,7 +4311,7 @@
         <w:pStyle w:val="ListBullet"/>
       </w:pPr>
       <w:r>
-        <w:t>Verified Lab 1 workbook and Word brief, or supplied checkpoint and snapshot.</w:t>
+        <w:t>Your Lab 1 workbook and Word brief.</w:t>
       </w:r>
     </w:p>
     <w:p>
@@ -4360,7 +4339,7 @@
         <w:t xml:space="preserve">1.  </w:t>
       </w:r>
       <w:r>
-        <w:t>Open your Lab 1 Word brief and cleaned workbook. If needed use this lab’s verified checkpoint and snapshot, clearly recording rejoin. Read the synthetic email thread quoted in the Step 4 prompt. It asks for a portfolio update, not authorisation to reassign technicians.</w:t>
+        <w:t>Open your Lab 1 Word brief and cleaned workbook. Read the synthetic email thread quoted in the Step 4 prompt. It asks for a portfolio update, not authorisation to reassign technicians.</w:t>
       </w:r>
     </w:p>
     <w:p>
@@ -4945,27 +4924,6 @@
           <w:color w:val="1F6FEB"/>
           <w:sz w:val="22"/>
         </w:rPr>
-        <w:t>Checkpoint and rejoin point</w:t>
-      </w:r>
-    </w:p>
-    <w:p>
-      <w:pPr>
-        <w:keepNext/>
-      </w:pPr>
-      <w:r>
-        <w:t>If you fell behind, use data/checkpoints/Northstar_Verified_Checkpoint.xlsx and data/checkpoints/Northstar_Verified_Snapshot.docx. Record checkpoint used in Prompt_Log; then perform this lab, rather than claiming the checkpoint as your output.</w:t>
-      </w:r>
-    </w:p>
-    <w:p>
-      <w:pPr>
-        <w:keepNext/>
-      </w:pPr>
-      <w:r>
-        <w:rPr>
-          <w:b/>
-          <w:color w:val="1F6FEB"/>
-          <w:sz w:val="22"/>
-        </w:rPr>
         <w:t>Troubleshooting</w:t>
       </w:r>
     </w:p>
@@ -5187,7 +5145,7 @@
         <w:rPr>
           <w:sz w:val="20"/>
         </w:rPr>
-        <w:t>The lab folder labs/lab-02-*/ holds the instruction PDF with sample prompts, a data folder with templates, checkpoints and the mock-data workbook (data/Northstar_Work_Orders.xlsx). Northstar Water Services is a fictional water-pipe maintenance and service company. All service hubs, staff and work orders are synthetic. Use the fixed reporting date 2026-09-30; missing facts remain UNKNOWN. Proposals do not change real assignments. Training email drafts are never sent.</w:t>
+        <w:t>The lab folder labs/lab-02-*/ holds the instruction PDF with sample prompts, a data folder with the lab workbook and any templates (data/Northstar_Work_Orders.xlsx). Northstar Water Services is a fictional water-pipe maintenance and service company. All service hubs, staff and work orders are synthetic. Use the fixed reporting date 2026-09-30; missing facts remain UNKNOWN. Proposals do not change real assignments. Training email drafts are never sent.</w:t>
       </w:r>
     </w:p>
     <w:p/>
@@ -5205,7 +5163,7 @@
         <w:keepNext/>
       </w:pPr>
       <w:r>
-        <w:t>Use this checkpoint to explain what you can now do and identify any lab evidence you still need to repair.</w:t>
+        <w:t>Use this recap to explain what you can now do and identify any lab evidence you still need to repair.</w:t>
       </w:r>
     </w:p>
     <w:tbl>
@@ -6361,27 +6319,6 @@
           <w:color w:val="1F6FEB"/>
           <w:sz w:val="22"/>
         </w:rPr>
-        <w:t>Checkpoint and rejoin point</w:t>
-      </w:r>
-    </w:p>
-    <w:p>
-      <w:pPr>
-        <w:keepNext/>
-      </w:pPr>
-      <w:r>
-        <w:t>If you fell behind, use data/checkpoints/Northstar_Verified_Checkpoint.xlsx and data/checkpoints/Northstar_Verified_Snapshot.docx. Record checkpoint used in Prompt_Log; then perform this lab, rather than claiming the checkpoint as your output.</w:t>
-      </w:r>
-    </w:p>
-    <w:p>
-      <w:pPr>
-        <w:keepNext/>
-      </w:pPr>
-      <w:r>
-        <w:rPr>
-          <w:b/>
-          <w:color w:val="1F6FEB"/>
-          <w:sz w:val="22"/>
-        </w:rPr>
         <w:t>Troubleshooting</w:t>
       </w:r>
     </w:p>
@@ -6603,7 +6540,7 @@
         <w:rPr>
           <w:sz w:val="20"/>
         </w:rPr>
-        <w:t>The lab folder labs/lab-03-*/ holds the instruction PDF with sample prompts, a data folder with templates, checkpoints and the mock-data workbook (data/Northstar_Work_Orders.xlsx). Northstar Water Services is a fictional water-pipe maintenance and service company. All service hubs, staff and work orders are synthetic. Use the fixed reporting date 2026-09-30; missing facts remain UNKNOWN. Proposals do not change real assignments. Training email drafts are never sent.</w:t>
+        <w:t>The lab folder labs/lab-03-*/ holds the instruction PDF with sample prompts, a data folder with the lab workbook and any templates (data/Northstar_Work_Orders.xlsx). Northstar Water Services is a fictional water-pipe maintenance and service company. All service hubs, staff and work orders are synthetic. Use the fixed reporting date 2026-09-30; missing facts remain UNKNOWN. Proposals do not change real assignments. Training email drafts are never sent.</w:t>
       </w:r>
     </w:p>
     <w:p/>
@@ -6949,7 +6886,7 @@
         <w:pStyle w:val="ListBullet"/>
       </w:pPr>
       <w:r>
-        <w:t>Lab 3 scope comparison; verified Lab1 clean source or supplied checkpoint.</w:t>
+        <w:t>Lab 3 scope comparison.</w:t>
       </w:r>
     </w:p>
     <w:p>
@@ -7936,27 +7873,6 @@
           <w:color w:val="1F6FEB"/>
           <w:sz w:val="22"/>
         </w:rPr>
-        <w:t>Checkpoint and rejoin point</w:t>
-      </w:r>
-    </w:p>
-    <w:p>
-      <w:pPr>
-        <w:keepNext/>
-      </w:pPr>
-      <w:r>
-        <w:t>If you fell behind, use data/checkpoints/Northstar_Verified_Checkpoint.xlsx and data/checkpoints/Northstar_Verified_Snapshot.docx. Record checkpoint used in Prompt_Log; then perform this lab, rather than claiming the checkpoint as your output.</w:t>
-      </w:r>
-    </w:p>
-    <w:p>
-      <w:pPr>
-        <w:keepNext/>
-      </w:pPr>
-      <w:r>
-        <w:rPr>
-          <w:b/>
-          <w:color w:val="1F6FEB"/>
-          <w:sz w:val="22"/>
-        </w:rPr>
         <w:t>Troubleshooting</w:t>
       </w:r>
     </w:p>
@@ -8178,7 +8094,7 @@
         <w:rPr>
           <w:sz w:val="20"/>
         </w:rPr>
-        <w:t>The lab folder labs/lab-04-*/ holds the instruction PDF with sample prompts, a data folder with templates, checkpoints and the mock-data workbook (data/Northstar_Work_Orders.xlsx). Northstar Water Services is a fictional water-pipe maintenance and service company. All service hubs, staff and work orders are synthetic. Use the fixed reporting date 2026-09-30; missing facts remain UNKNOWN. Proposals do not change real assignments. Training email drafts are never sent.</w:t>
+        <w:t>The lab folder labs/lab-04-*/ holds the instruction PDF with sample prompts, a data folder with the lab workbook and any templates (data/Northstar_Work_Orders.xlsx). Northstar Water Services is a fictional water-pipe maintenance and service company. All service hubs, staff and work orders are synthetic. Use the fixed reporting date 2026-09-30; missing facts remain UNKNOWN. Proposals do not change real assignments. Training email drafts are never sent.</w:t>
       </w:r>
     </w:p>
     <w:p/>
@@ -9557,27 +9473,6 @@
           <w:color w:val="1F6FEB"/>
           <w:sz w:val="22"/>
         </w:rPr>
-        <w:t>Checkpoint and rejoin point</w:t>
-      </w:r>
-    </w:p>
-    <w:p>
-      <w:pPr>
-        <w:keepNext/>
-      </w:pPr>
-      <w:r>
-        <w:t>If you fell behind, use data/checkpoints/Northstar_Verified_Checkpoint.xlsx and data/checkpoints/Northstar_Verified_Snapshot.docx. Record checkpoint used in Prompt_Log; then perform this lab, rather than claiming the checkpoint as your output.</w:t>
-      </w:r>
-    </w:p>
-    <w:p>
-      <w:pPr>
-        <w:keepNext/>
-      </w:pPr>
-      <w:r>
-        <w:rPr>
-          <w:b/>
-          <w:color w:val="1F6FEB"/>
-          <w:sz w:val="22"/>
-        </w:rPr>
         <w:t>Troubleshooting</w:t>
       </w:r>
     </w:p>
@@ -9799,7 +9694,7 @@
         <w:rPr>
           <w:sz w:val="20"/>
         </w:rPr>
-        <w:t>The lab folder labs/lab-05-*/ holds the instruction PDF with sample prompts, a data folder with templates, checkpoints and the mock-data workbook (data/Northstar_Work_Orders.xlsx), plus data/templates/water-service-pareto/SKILL.md (Reviewed Pareto Skill fallback). Northstar Water Services is a fictional water-pipe maintenance and service company. All service hubs, staff and work orders are synthetic. Use the fixed reporting date 2026-09-30; missing facts remain UNKNOWN. Proposals do not change real assignments. Training email drafts are never sent.</w:t>
+        <w:t>The lab folder labs/lab-05-*/ holds the instruction PDF with sample prompts, a data folder with the lab workbook and any templates (data/Northstar_Work_Orders.xlsx), plus data/templates/water-service-pareto/SKILL.md (Reviewed Pareto Skill fallback). Northstar Water Services is a fictional water-pipe maintenance and service company. All service hubs, staff and work orders are synthetic. Use the fixed reporting date 2026-09-30; missing facts remain UNKNOWN. Proposals do not change real assignments. Training email drafts are never sent.</w:t>
       </w:r>
     </w:p>
     <w:p/>
@@ -10771,15 +10666,15 @@
     </w:p>
     <w:p>
       <w:r>
-        <w:t>Goal: Reuse the Skill-authoring and installation method from Lab 5 to create maintenance-reporting. Apply it in Excel and PowerPoint, test missing inputs and a controlled rerun, then refine v2 using actual evidence. The supplied reviewed template supports rejoining; it is not proof of native execution.</w:t>
-      </w:r>
-    </w:p>
-    <w:p>
-      <w:pPr>
-        <w:keepNext/>
-      </w:pPr>
-      <w:r>
-        <w:t>Reuse the Skill-authoring and installation method from Lab 5 to create maintenance-reporting. Apply it in Excel and PowerPoint, test missing inputs and a controlled rerun, then refine v2 using actual evidence. The supplied reviewed template supports rejoining; it is not proof of native execution.</w:t>
+        <w:t>Goal: Reuse the Skill-authoring and installation method from Lab 5 to create maintenance-reporting. Apply it in Excel and PowerPoint, test missing inputs and a controlled rerun, then refine v2 using actual evidence. The supplied reviewed template is a fallback if your own draft is incomplete.</w:t>
+      </w:r>
+    </w:p>
+    <w:p>
+      <w:pPr>
+        <w:keepNext/>
+      </w:pPr>
+      <w:r>
+        <w:t>Reuse the Skill-authoring and installation method from Lab 5 to create maintenance-reporting. Apply it in Excel and PowerPoint, test missing inputs and a controlled rerun, then refine v2 using actual evidence. The supplied reviewed template is a fallback if your own draft is incomplete.</w:t>
       </w:r>
     </w:p>
     <w:p>
@@ -10989,7 +10884,7 @@
         <w:t xml:space="preserve">4.  </w:t>
       </w:r>
       <w:r>
-        <w:t>Check the unassigned backlog count against Control. A technician with the same category may still lack usable capacity: use available hours minus known proposed hours, flag conflicts, and do not convert a suggestion into confirmed assignment. Copy your verified summary into a copy of data/checkpoints/Northstar_Verified_Snapshot.docx, preserving measures and date.</w:t>
+        <w:t>Check the unassigned backlog count against Control. A technician with the same category may still lack usable capacity: use available hours minus known proposed hours, flag conflicts, and do not convert a suggestion into confirmed assignment. Copy your verified summary into a new Word document named Northstar_Verified_Snapshot.docx, preserving measures and date.</w:t>
       </w:r>
     </w:p>
     <w:p>
@@ -11031,7 +10926,7 @@
         <w:t xml:space="preserve">5.  </w:t>
       </w:r>
       <w:r>
-        <w:t>In PowerPoint select the reviewed Word snapshot and open the four-slide update from Lab2 or data/checkpoints/Northstar_Initial_Update_Checkpoint.pptx. Use Copilot &gt; + &gt; Choose skills &gt; Manage skills &gt; Add skill to upload the reviewed maintenance-reporting file, or use the app’s own supported Skills folder. Verify it in PowerPoint separately from Excel. If missing, paste the complete reviewed Skill plus snapshot as manual instructions and remove @mention. Apply the following refinement after review.</w:t>
+        <w:t>In PowerPoint select the reviewed Word snapshot and open your four-slide update from Lab 2. Use Copilot &gt; + &gt; Choose skills &gt; Manage skills &gt; Add skill to upload the reviewed maintenance-reporting file, or use the app’s own supported Skills folder. Verify it in PowerPoint separately from Excel. If missing, paste the complete reviewed Skill plus snapshot as manual instructions and remove @mention. Apply the following refinement after review.</w:t>
       </w:r>
     </w:p>
     <w:p>
@@ -11517,27 +11412,6 @@
           <w:color w:val="1F6FEB"/>
           <w:sz w:val="22"/>
         </w:rPr>
-        <w:t>Checkpoint and rejoin point</w:t>
-      </w:r>
-    </w:p>
-    <w:p>
-      <w:pPr>
-        <w:keepNext/>
-      </w:pPr>
-      <w:r>
-        <w:t>If you fell behind, use data/checkpoints/Northstar_Verified_Checkpoint.xlsx and data/checkpoints/Northstar_Verified_Snapshot.docx. Record checkpoint used in Prompt_Log; then perform this lab, rather than claiming the checkpoint as your output.</w:t>
-      </w:r>
-    </w:p>
-    <w:p>
-      <w:pPr>
-        <w:keepNext/>
-      </w:pPr>
-      <w:r>
-        <w:rPr>
-          <w:b/>
-          <w:color w:val="1F6FEB"/>
-          <w:sz w:val="22"/>
-        </w:rPr>
         <w:t>Troubleshooting</w:t>
       </w:r>
     </w:p>
@@ -11759,7 +11633,7 @@
         <w:rPr>
           <w:sz w:val="20"/>
         </w:rPr>
-        <w:t>The lab folder labs/lab-06-*/ holds the instruction PDF with sample prompts, a data folder with templates, checkpoints and the mock-data workbook (data/Northstar_Work_Orders.xlsx), plus data/templates/maintenance-reporting/SKILL.md (Reviewed reporting Skill fallback). Northstar Water Services is a fictional water-pipe maintenance and service company. All service hubs, staff and work orders are synthetic. Use the fixed reporting date 2026-09-30; missing facts remain UNKNOWN. Proposals do not change real assignments. Training email drafts are never sent.</w:t>
+        <w:t>The lab folder labs/lab-06-*/ holds the instruction PDF with sample prompts, a data folder with the lab workbook and any templates (data/Northstar_Work_Orders.xlsx), plus data/templates/maintenance-reporting/SKILL.md (Reviewed reporting Skill fallback). Northstar Water Services is a fictional water-pipe maintenance and service company. All service hubs, staff and work orders are synthetic. Use the fixed reporting date 2026-09-30; missing facts remain UNKNOWN. Proposals do not change real assignments. Training email drafts are never sent.</w:t>
       </w:r>
     </w:p>
     <w:p/>
@@ -11777,7 +11651,7 @@
         <w:keepNext/>
       </w:pPr>
       <w:r>
-        <w:t>Use this checkpoint to explain what you can now do and identify any lab evidence you still need to repair.</w:t>
+        <w:t>Use this recap to explain what you can now do and identify any lab evidence you still need to repair.</w:t>
       </w:r>
     </w:p>
     <w:tbl>
@@ -12761,7 +12635,7 @@
         <w:pStyle w:val="ListBullet"/>
       </w:pPr>
       <w:r>
-        <w:t>Verified clean table from earlier labs or supplied clean checkpoint.</w:t>
+        <w:t>The clean table from earlier labs.</w:t>
       </w:r>
     </w:p>
     <w:p>
@@ -13456,27 +13330,6 @@
           <w:color w:val="1F6FEB"/>
           <w:sz w:val="22"/>
         </w:rPr>
-        <w:t>Checkpoint and rejoin point</w:t>
-      </w:r>
-    </w:p>
-    <w:p>
-      <w:pPr>
-        <w:keepNext/>
-      </w:pPr>
-      <w:r>
-        <w:t>If you fell behind, use data/checkpoints/Northstar_Verified_Checkpoint.xlsx and data/checkpoints/Northstar_Verified_Snapshot.docx. Record checkpoint used in Prompt_Log; then perform this lab, rather than claiming the checkpoint as your output.</w:t>
-      </w:r>
-    </w:p>
-    <w:p>
-      <w:pPr>
-        <w:keepNext/>
-      </w:pPr>
-      <w:r>
-        <w:rPr>
-          <w:b/>
-          <w:color w:val="1F6FEB"/>
-          <w:sz w:val="22"/>
-        </w:rPr>
         <w:t>Troubleshooting</w:t>
       </w:r>
     </w:p>
@@ -13698,7 +13551,7 @@
         <w:rPr>
           <w:sz w:val="20"/>
         </w:rPr>
-        <w:t>The lab folder labs/lab-07-*/ holds the instruction PDF with sample prompts, a data folder with templates, checkpoints and the mock-data workbook (data/Northstar_Work_Orders.xlsx), plus data/templates/water-service-dashboard/SKILL.md (Reviewed interactive dashboard Skill fallback). Northstar Water Services is a fictional water-pipe maintenance and service company. All service hubs, staff and work orders are synthetic. Use the fixed reporting date 2026-09-30; missing facts remain UNKNOWN. Proposals do not change real assignments. Training email drafts are never sent.</w:t>
+        <w:t>The lab folder labs/lab-07-*/ holds the instruction PDF with sample prompts, a data folder with the lab workbook and any templates (data/Northstar_Work_Orders.xlsx), plus data/templates/water-service-dashboard/SKILL.md (Reviewed interactive dashboard Skill fallback). Northstar Water Services is a fictional water-pipe maintenance and service company. All service hubs, staff and work orders are synthetic. Use the fixed reporting date 2026-09-30; missing facts remain UNKNOWN. Proposals do not change real assignments. Training email drafts are never sent.</w:t>
       </w:r>
     </w:p>
     <w:p/>
@@ -14264,7 +14117,7 @@
         <w:pStyle w:val="ListBullet"/>
       </w:pPr>
       <w:r>
-        <w:t>Lab 7 dashboard or supplied formula checkpoint.</w:t>
+        <w:t>Your Lab 7 dashboard.</w:t>
       </w:r>
     </w:p>
     <w:p>
@@ -14300,7 +14153,7 @@
         <w:t xml:space="preserve">1.  </w:t>
       </w:r>
       <w:r>
-        <w:t>Open your Lab 7 baseline dashboard. Rejoin using data/checkpoints/Northstar_Verified_Checkpoint.xlsx only if needed; record that it is an example formula dashboard. Set all four selections B2:B5 to All and confirm 120. Save baseline before creating any refresh-test copy.</w:t>
+        <w:t>Open your Lab 7 baseline dashboard. Set all four selections B2:B5 to All and confirm 120. Save baseline before creating any refresh-test copy.</w:t>
       </w:r>
     </w:p>
     <w:p>
@@ -15088,27 +14941,6 @@
           <w:color w:val="1F6FEB"/>
           <w:sz w:val="22"/>
         </w:rPr>
-        <w:t>Checkpoint and rejoin point</w:t>
-      </w:r>
-    </w:p>
-    <w:p>
-      <w:pPr>
-        <w:keepNext/>
-      </w:pPr>
-      <w:r>
-        <w:t>If you fell behind, use data/checkpoints/Northstar_Verified_Checkpoint.xlsx and data/checkpoints/Northstar_Verified_Snapshot.docx. Record checkpoint used in Prompt_Log; then perform this lab, rather than claiming the checkpoint as your output.</w:t>
-      </w:r>
-    </w:p>
-    <w:p>
-      <w:pPr>
-        <w:keepNext/>
-      </w:pPr>
-      <w:r>
-        <w:rPr>
-          <w:b/>
-          <w:color w:val="1F6FEB"/>
-          <w:sz w:val="22"/>
-        </w:rPr>
         <w:t>Troubleshooting</w:t>
       </w:r>
     </w:p>
@@ -15330,7 +15162,7 @@
         <w:rPr>
           <w:sz w:val="20"/>
         </w:rPr>
-        <w:t>The lab folder labs/lab-08-*/ holds the instruction PDF with sample prompts, a data folder with templates, checkpoints and the mock-data workbook (data/Northstar_Work_Orders.xlsx), plus data/templates/water-service-dashboard/SKILL.md (Reviewed dashboard Skill for reruns). Northstar Water Services is a fictional water-pipe maintenance and service company. All service hubs, staff and work orders are synthetic. Use the fixed reporting date 2026-09-30; missing facts remain UNKNOWN. Proposals do not change real assignments. Training email drafts are never sent.</w:t>
+        <w:t>The lab folder labs/lab-08-*/ holds the instruction PDF with sample prompts, a data folder with the lab workbook and any templates (data/Northstar_Work_Orders.xlsx), plus data/templates/water-service-dashboard/SKILL.md (Reviewed dashboard Skill for reruns). Northstar Water Services is a fictional water-pipe maintenance and service company. All service hubs, staff and work orders are synthetic. Use the fixed reporting date 2026-09-30; missing facts remain UNKNOWN. Proposals do not change real assignments. Training email drafts are never sent.</w:t>
       </w:r>
     </w:p>
     <w:p/>
@@ -15348,7 +15180,7 @@
         <w:keepNext/>
       </w:pPr>
       <w:r>
-        <w:t>Use this checkpoint to explain what you can now do and identify any lab evidence you still need to repair.</w:t>
+        <w:t>Use this recap to explain what you can now do and identify any lab evidence you still need to repair.</w:t>
       </w:r>
     </w:p>
     <w:tbl>
@@ -16148,7 +15980,7 @@
         <w:t xml:space="preserve">1.  </w:t>
       </w:r>
       <w:r>
-        <w:t>Open the untouched baseline Northstar_Dashboard.xlsx from Lab 8; confirm All selectors, total120 and report date2026-09-30. Do not use the 122-row sandbox. If needed use this lab’s checkpoint and record rejoin. Record verified metric/chart values in the Evidence_Log sheet with source sheet/table, scope and date.</w:t>
+        <w:t>Open the untouched baseline Northstar_Dashboard.xlsx from Lab 8; confirm All selectors, total120 and report date2026-09-30. Do not use the 122-row sandbox. Record verified metric/chart values in the Evidence_Log sheet with source sheet/table, scope and date.</w:t>
       </w:r>
     </w:p>
     <w:p>
@@ -16692,27 +16524,6 @@
           <w:color w:val="1F6FEB"/>
           <w:sz w:val="22"/>
         </w:rPr>
-        <w:t>Checkpoint and rejoin point</w:t>
-      </w:r>
-    </w:p>
-    <w:p>
-      <w:pPr>
-        <w:keepNext/>
-      </w:pPr>
-      <w:r>
-        <w:t>If you fell behind, use data/checkpoints/Northstar_Verified_Checkpoint.xlsx and data/checkpoints/Northstar_Verified_Snapshot.docx. Record checkpoint used in Prompt_Log; then perform this lab, rather than claiming the checkpoint as your output.</w:t>
-      </w:r>
-    </w:p>
-    <w:p>
-      <w:pPr>
-        <w:keepNext/>
-      </w:pPr>
-      <w:r>
-        <w:rPr>
-          <w:b/>
-          <w:color w:val="1F6FEB"/>
-          <w:sz w:val="22"/>
-        </w:rPr>
         <w:t>Troubleshooting</w:t>
       </w:r>
     </w:p>
@@ -16934,7 +16745,7 @@
         <w:rPr>
           <w:sz w:val="20"/>
         </w:rPr>
-        <w:t>The lab folder labs/lab-09-*/ holds the instruction PDF with sample prompts, a data folder with templates, checkpoints and the mock-data workbook (data/Northstar_Work_Orders.xlsx). Northstar Water Services is a fictional water-pipe maintenance and service company. All service hubs, staff and work orders are synthetic. Use the fixed reporting date 2026-09-30; missing facts remain UNKNOWN. Proposals do not change real assignments. Training email drafts are never sent.</w:t>
+        <w:t>The lab folder labs/lab-09-*/ holds the instruction PDF with sample prompts, a data folder with the lab workbook and any templates (data/Northstar_Work_Orders.xlsx). Northstar Water Services is a fictional water-pipe maintenance and service company. All service hubs, staff and work orders are synthetic. Use the fixed reporting date 2026-09-30; missing facts remain UNKNOWN. Proposals do not change real assignments. Training email drafts are never sent.</w:t>
       </w:r>
     </w:p>
     <w:p/>
@@ -17528,7 +17339,7 @@
         <w:t xml:space="preserve">1.  </w:t>
       </w:r>
       <w:r>
-        <w:t>Open your Lab 9 draft and save as Northstar_Management_Final.pptx. Rejoin only if necessary using data/checkpoints/Northstar_Management_Example.pptx and snapshot; review and adapt its supplied example charts and narrative against the verified snapshot. Open the same reviewed brief in the file picker; confirm native skill or label manual practice.</w:t>
+        <w:t>Open your Lab 9 draft and save as Northstar_Management_Final.pptx. Open the same reviewed brief in the file picker; confirm native skill or label manual practice.</w:t>
       </w:r>
     </w:p>
     <w:p>
@@ -18126,27 +17937,6 @@
           <w:color w:val="1F6FEB"/>
           <w:sz w:val="22"/>
         </w:rPr>
-        <w:t>Checkpoint and rejoin point</w:t>
-      </w:r>
-    </w:p>
-    <w:p>
-      <w:pPr>
-        <w:keepNext/>
-      </w:pPr>
-      <w:r>
-        <w:t>If you fell behind, use data/checkpoints/Northstar_Verified_Checkpoint.xlsx and data/checkpoints/Northstar_Verified_Snapshot.docx. Record checkpoint used in Prompt_Log; then perform this lab, rather than claiming the checkpoint as your output.</w:t>
-      </w:r>
-    </w:p>
-    <w:p>
-      <w:pPr>
-        <w:keepNext/>
-      </w:pPr>
-      <w:r>
-        <w:rPr>
-          <w:b/>
-          <w:color w:val="1F6FEB"/>
-          <w:sz w:val="22"/>
-        </w:rPr>
         <w:t>Troubleshooting</w:t>
       </w:r>
     </w:p>
@@ -18368,7 +18158,7 @@
         <w:rPr>
           <w:sz w:val="20"/>
         </w:rPr>
-        <w:t>The lab folder labs/lab-10-*/ holds the instruction PDF with sample prompts, a data folder with templates, checkpoints and the mock-data workbook (data/Northstar_Work_Orders.xlsx). Northstar Water Services is a fictional water-pipe maintenance and service company. All service hubs, staff and work orders are synthetic. Use the fixed reporting date 2026-09-30; missing facts remain UNKNOWN. Proposals do not change real assignments. Training email drafts are never sent.</w:t>
+        <w:t>The lab folder labs/lab-10-*/ holds the instruction PDF with sample prompts, a data folder with the lab workbook and any templates (data/Northstar_Work_Orders.xlsx). Northstar Water Services is a fictional water-pipe maintenance and service company. All service hubs, staff and work orders are synthetic. Use the fixed reporting date 2026-09-30; missing facts remain UNKNOWN. Proposals do not change real assignments. Training email drafts are never sent.</w:t>
       </w:r>
     </w:p>
     <w:p/>
@@ -18386,7 +18176,7 @@
         <w:keepNext/>
       </w:pPr>
       <w:r>
-        <w:t>Use this checkpoint to explain what you can now do and identify any lab evidence you still need to repair.</w:t>
+        <w:t>Use this recap to explain what you can now do and identify any lab evidence you still need to repair.</w:t>
       </w:r>
     </w:p>
     <w:tbl>
@@ -19535,7 +19325,7 @@
           <w:color w:val="1F6FEB"/>
           <w:sz w:val="22"/>
         </w:rPr>
-        <w:t>Checkpoint and rejoin point</w:t>
+        <w:t>If you get stuck</w:t>
       </w:r>
     </w:p>
     <w:p>
@@ -19777,7 +19567,7 @@
         <w:rPr>
           <w:sz w:val="20"/>
         </w:rPr>
-        <w:t>The lab folder labs/lab-11-*/ holds the instruction PDF with sample prompts, a data folder with templates, checkpoints and the mock-data workbook (data/knowledge/Northstar_Service_Handbook.docx, data/knowledge/Northstar_Work_Orders_Clean.xlsx). Northstar Water Services is a fictional water-pipe maintenance and service company. All service hubs, staff and work orders are synthetic. Use the fixed reporting date 2026-09-30; missing facts remain UNKNOWN. Proposals do not change real assignments. Training email drafts are never sent.</w:t>
+        <w:t>The lab folder labs/lab-11-*/ holds the instruction PDF with sample prompts, a data folder with the lab workbook and any templates (data/knowledge/Northstar_Service_Handbook.docx, data/knowledge/Northstar_Work_Orders_Clean.xlsx). Northstar Water Services is a fictional water-pipe maintenance and service company. All service hubs, staff and work orders are synthetic. Use the fixed reporting date 2026-09-30; missing facts remain UNKNOWN. Proposals do not change real assignments. Training email drafts are never sent.</w:t>
       </w:r>
     </w:p>
     <w:p/>
@@ -20850,15 +20640,15 @@
           <w:color w:val="1F6FEB"/>
           <w:sz w:val="22"/>
         </w:rPr>
-        <w:t>Checkpoint and rejoin point</w:t>
-      </w:r>
-    </w:p>
-    <w:p>
-      <w:pPr>
-        <w:keepNext/>
-      </w:pPr>
-      <w:r>
-        <w:t>Short of time? Use the Lab 8 checkpoint dashboard and the Lab 10 example deck as your evidence, and say so in the showcase.</w:t>
+        <w:t>If you get stuck</w:t>
+      </w:r>
+    </w:p>
+    <w:p>
+      <w:pPr>
+        <w:keepNext/>
+      </w:pPr>
+      <w:r>
+        <w:t>Short of time? Present the Lab 8 Northstar dashboard and your Lab 10 deck instead, and say so in the showcase.</w:t>
       </w:r>
     </w:p>
     <w:p>
@@ -21092,7 +20882,7 @@
         <w:rPr>
           <w:sz w:val="20"/>
         </w:rPr>
-        <w:t>The lab folder labs/lab-12-*/ holds the instruction PDF with sample prompts, a data folder with templates, checkpoints and the mock-data workbook (Your own mock or sanitised dataset). Northstar Water Services is a fictional water-pipe maintenance and service company. All service hubs, staff and work orders are synthetic. Use the fixed reporting date 2026-09-30; missing facts remain UNKNOWN. Proposals do not change real assignments. Training email drafts are never sent.</w:t>
+        <w:t>The lab folder labs/lab-12-*/ holds the instruction PDF with sample prompts, a data folder with the lab workbook and any templates (Your own mock or sanitised dataset). Northstar Water Services is a fictional water-pipe maintenance and service company. All service hubs, staff and work orders are synthetic. Use the fixed reporting date 2026-09-30; missing facts remain UNKNOWN. Proposals do not change real assignments. Training email drafts are never sent.</w:t>
       </w:r>
     </w:p>
     <w:p/>
@@ -21110,7 +20900,7 @@
         <w:keepNext/>
       </w:pPr>
       <w:r>
-        <w:t>Use this checkpoint to explain what you can now do and identify any lab evidence you still need to repair.</w:t>
+        <w:t>Use this recap to explain what you can now do and identify any lab evidence you still need to repair.</w:t>
       </w:r>
     </w:p>
     <w:tbl>

</xml_diff>

<commit_message>
feat: close the course with the 5 principles of AI security
The AI security tiles move from Topic 1 to the closing slide before
Thank You, and the Learner Guide ends with the same five principles.

Co-Authored-By: Claude Opus 5.5 <noreply@anthropic.com>
</commit_message>
<xml_diff>
--- a/courseware/LG-GenAI for Engineers.docx
+++ b/courseware/LG-GenAI for Engineers.docx
@@ -697,7 +697,7 @@
           <w:color w:val="333333"/>
           <w:sz w:val="21"/>
         </w:rPr>
-        <w:t>AI Security: Five Principles</w:t>
+        <w:t>Prompts and Verified App Handoffs</w:t>
         <w:tab/>
         <w:t>13</w:t>
       </w:r>
@@ -717,7 +717,7 @@
           <w:color w:val="333333"/>
           <w:sz w:val="21"/>
         </w:rPr>
-        <w:t>Prompts and Verified App Handoffs</w:t>
+        <w:t>Outlook Drafting and Operational Decisions</w:t>
         <w:tab/>
         <w:t>14</w:t>
       </w:r>
@@ -737,7 +737,7 @@
           <w:color w:val="333333"/>
           <w:sz w:val="21"/>
         </w:rPr>
-        <w:t>Outlook Drafting and Operational Decisions</w:t>
+        <w:t>Lab 2 · Word to PowerPoint and Outlook — Create the Cross-App Maintenance Update</w:t>
         <w:tab/>
         <w:t>15</w:t>
       </w:r>
@@ -757,9 +757,28 @@
           <w:color w:val="333333"/>
           <w:sz w:val="21"/>
         </w:rPr>
-        <w:t>Lab 2 · Word to PowerPoint and Outlook — Create the Cross-App Maintenance Update</w:t>
+        <w:t>Topic 1 Recap - Mapped to Learning Outcomes</w:t>
         <w:tab/>
-        <w:t>15</w:t>
+        <w:t>18</w:t>
+      </w:r>
+    </w:p>
+    <w:p>
+      <w:pPr>
+        <w:tabs>
+          <w:tab w:pos="9072" w:val="right" w:leader="dot"/>
+        </w:tabs>
+        <w:spacing w:after="60"/>
+      </w:pPr>
+      <w:r>
+        <w:rPr>
+          <w:rFonts w:ascii="Arial" w:hAnsi="Arial"/>
+          <w:b/>
+          <w:color w:val="333333"/>
+          <w:sz w:val="22"/>
+        </w:rPr>
+        <w:t>Topic 2 — Personalisation, .Rules and Skills for Excel</w:t>
+        <w:tab/>
+        <w:t>18</w:t>
       </w:r>
     </w:p>
     <w:p>
@@ -777,28 +796,9 @@
           <w:color w:val="333333"/>
           <w:sz w:val="21"/>
         </w:rPr>
-        <w:t>Topic 1 Recap - Mapped to Learning Outcomes</w:t>
+        <w:t>Account Personalisation and Specific Requests</w:t>
         <w:tab/>
-        <w:t>19</w:t>
-      </w:r>
-    </w:p>
-    <w:p>
-      <w:pPr>
-        <w:tabs>
-          <w:tab w:pos="9072" w:val="right" w:leader="dot"/>
-        </w:tabs>
-        <w:spacing w:after="60"/>
-      </w:pPr>
-      <w:r>
-        <w:rPr>
-          <w:rFonts w:ascii="Arial" w:hAnsi="Arial"/>
-          <w:b/>
-          <w:color w:val="333333"/>
-          <w:sz w:val="22"/>
-        </w:rPr>
-        <w:t>Topic 2 — Personalisation, .Rules and Skills for Excel</w:t>
-        <w:tab/>
-        <w:t>19</w:t>
+        <w:t>18</w:t>
       </w:r>
     </w:p>
     <w:p>
@@ -816,7 +816,7 @@
           <w:color w:val="333333"/>
           <w:sz w:val="21"/>
         </w:rPr>
-        <w:t>Account Personalisation and Specific Requests</w:t>
+        <w:t>Lab 3 · Personalisation — Personalise Copilot in Excel for Consistent Service Reports</w:t>
         <w:tab/>
         <w:t>19</w:t>
       </w:r>
@@ -836,9 +836,9 @@
           <w:color w:val="333333"/>
           <w:sz w:val="21"/>
         </w:rPr>
-        <w:t>Lab 3 · Personalisation — Personalise Copilot in Excel for Consistent Service Reports</w:t>
+        <w:t>Visible Workbook .Rules and Formula Results</w:t>
         <w:tab/>
-        <w:t>20</w:t>
+        <w:t>23</w:t>
       </w:r>
     </w:p>
     <w:p>
@@ -856,9 +856,9 @@
           <w:color w:val="333333"/>
           <w:sz w:val="21"/>
         </w:rPr>
-        <w:t>Visible Workbook .Rules and Formula Results</w:t>
+        <w:t>Lab 4 · Workbook .Rules — Create and Test Workbook .Rules for Water Service Reporting</w:t>
         <w:tab/>
-        <w:t>23</w:t>
+        <w:t>24</w:t>
       </w:r>
     </w:p>
     <w:p>
@@ -876,9 +876,9 @@
           <w:color w:val="333333"/>
           <w:sz w:val="21"/>
         </w:rPr>
-        <w:t>Lab 4 · Workbook .Rules — Create and Test Workbook .Rules for Water Service Reporting</w:t>
+        <w:t>Built-in and Custom Skills</w:t>
         <w:tab/>
-        <w:t>24</w:t>
+        <w:t>29</w:t>
       </w:r>
     </w:p>
     <w:p>
@@ -896,9 +896,9 @@
           <w:color w:val="333333"/>
           <w:sz w:val="21"/>
         </w:rPr>
-        <w:t>Built-in and Custom Skills</w:t>
+        <w:t>Pareto Skill: Counts, Sorting and Cumulative Share</w:t>
         <w:tab/>
-        <w:t>29</w:t>
+        <w:t>30</w:t>
       </w:r>
     </w:p>
     <w:p>
@@ -916,9 +916,9 @@
           <w:color w:val="333333"/>
           <w:sz w:val="21"/>
         </w:rPr>
-        <w:t>Pareto Skill: Counts, Sorting and Cumulative Share</w:t>
+        <w:t>Lab 5 · Custom Pareto Chart Skill — Use the Built-in Chart Skill, then Create a Custom Pareto Skill</w:t>
         <w:tab/>
-        <w:t>30</w:t>
+        <w:t>31</w:t>
       </w:r>
     </w:p>
     <w:p>
@@ -936,9 +936,9 @@
           <w:color w:val="333333"/>
           <w:sz w:val="21"/>
         </w:rPr>
-        <w:t>Lab 5 · Custom Pareto Chart Skill — Use the Built-in Chart Skill, then Create a Custom Pareto Skill</w:t>
+        <w:t>Skills, Prompts and Workbook Rules</w:t>
         <w:tab/>
-        <w:t>31</w:t>
+        <w:t>36</w:t>
       </w:r>
     </w:p>
     <w:p>
@@ -956,9 +956,9 @@
           <w:color w:val="333333"/>
           <w:sz w:val="21"/>
         </w:rPr>
-        <w:t>Skills, Prompts and Workbook Rules</w:t>
+        <w:t>Custom Skill Discovery in Each App</w:t>
         <w:tab/>
-        <w:t>36</w:t>
+        <w:t>37</w:t>
       </w:r>
     </w:p>
     <w:p>
@@ -976,7 +976,7 @@
           <w:color w:val="333333"/>
           <w:sz w:val="21"/>
         </w:rPr>
-        <w:t>Custom Skill Discovery in Each App</w:t>
+        <w:t>Repeatability and Safe Skill Reruns</w:t>
         <w:tab/>
         <w:t>37</w:t>
       </w:r>
@@ -996,9 +996,9 @@
           <w:color w:val="333333"/>
           <w:sz w:val="21"/>
         </w:rPr>
-        <w:t>Repeatability and Safe Skill Reruns</w:t>
+        <w:t>Assignment Proposals and Capacity Evidence</w:t>
         <w:tab/>
-        <w:t>37</w:t>
+        <w:t>38</w:t>
       </w:r>
     </w:p>
     <w:p>
@@ -1016,9 +1016,9 @@
           <w:color w:val="333333"/>
           <w:sz w:val="21"/>
         </w:rPr>
-        <w:t>Assignment Proposals and Capacity Evidence</w:t>
+        <w:t>Lab 6 · Reporting Skill — Create, Use and Improve the Maintenance Reporting Skill</w:t>
         <w:tab/>
-        <w:t>38</w:t>
+        <w:t>39</w:t>
       </w:r>
     </w:p>
     <w:p>
@@ -1036,9 +1036,28 @@
           <w:color w:val="333333"/>
           <w:sz w:val="21"/>
         </w:rPr>
-        <w:t>Lab 6 · Reporting Skill — Create, Use and Improve the Maintenance Reporting Skill</w:t>
+        <w:t>Topic 2 Recap - Mapped to Learning Outcomes</w:t>
         <w:tab/>
-        <w:t>39</w:t>
+        <w:t>44</w:t>
+      </w:r>
+    </w:p>
+    <w:p>
+      <w:pPr>
+        <w:tabs>
+          <w:tab w:pos="9072" w:val="right" w:leader="dot"/>
+        </w:tabs>
+        <w:spacing w:after="60"/>
+      </w:pPr>
+      <w:r>
+        <w:rPr>
+          <w:rFonts w:ascii="Arial" w:hAnsi="Arial"/>
+          <w:b/>
+          <w:color w:val="333333"/>
+          <w:sz w:val="22"/>
+        </w:rPr>
+        <w:t>Topic 3 — Interactive Dashboards with Custom Skills</w:t>
+        <w:tab/>
+        <w:t>44</w:t>
       </w:r>
     </w:p>
     <w:p>
@@ -1056,26 +1075,7 @@
           <w:color w:val="333333"/>
           <w:sz w:val="21"/>
         </w:rPr>
-        <w:t>Topic 2 Recap - Mapped to Learning Outcomes</w:t>
-        <w:tab/>
-        <w:t>44</w:t>
-      </w:r>
-    </w:p>
-    <w:p>
-      <w:pPr>
-        <w:tabs>
-          <w:tab w:pos="9072" w:val="right" w:leader="dot"/>
-        </w:tabs>
-        <w:spacing w:after="60"/>
-      </w:pPr>
-      <w:r>
-        <w:rPr>
-          <w:rFonts w:ascii="Arial" w:hAnsi="Arial"/>
-          <w:b/>
-          <w:color w:val="333333"/>
-          <w:sz w:val="22"/>
-        </w:rPr>
-        <w:t>Topic 3 — Interactive Dashboards with Custom Skills</w:t>
+        <w:t>Custom Dashboard Skill as a Reusable Contract</w:t>
         <w:tab/>
         <w:t>44</w:t>
       </w:r>
@@ -1095,9 +1095,9 @@
           <w:color w:val="333333"/>
           <w:sz w:val="21"/>
         </w:rPr>
-        <w:t>Custom Dashboard Skill as a Reusable Contract</w:t>
+        <w:t>Dashboard Measures and Denominators</w:t>
         <w:tab/>
-        <w:t>44</w:t>
+        <w:t>45</w:t>
       </w:r>
     </w:p>
     <w:p>
@@ -1115,9 +1115,9 @@
           <w:color w:val="333333"/>
           <w:sz w:val="21"/>
         </w:rPr>
-        <w:t>Dashboard Measures and Denominators</w:t>
+        <w:t>Visual Dashboard Design for Maintenance</w:t>
         <w:tab/>
-        <w:t>45</w:t>
+        <w:t>46</w:t>
       </w:r>
     </w:p>
     <w:p>
@@ -1135,9 +1135,9 @@
           <w:color w:val="333333"/>
           <w:sz w:val="21"/>
         </w:rPr>
-        <w:t>Visual Dashboard Design for Maintenance</w:t>
+        <w:t>Lab 7 · Custom Dashboard Skill — Create and Apply a Custom Interactive Dashboard Skill</w:t>
         <w:tab/>
-        <w:t>46</w:t>
+        <w:t>47</w:t>
       </w:r>
     </w:p>
     <w:p>
@@ -1155,9 +1155,9 @@
           <w:color w:val="333333"/>
           <w:sz w:val="21"/>
         </w:rPr>
-        <w:t>Lab 7 · Custom Dashboard Skill — Create and Apply a Custom Interactive Dashboard Skill</w:t>
+        <w:t>One Filter Scope for Every Visual</w:t>
         <w:tab/>
-        <w:t>47</w:t>
+        <w:t>51</w:t>
       </w:r>
     </w:p>
     <w:p>
@@ -1175,9 +1175,9 @@
           <w:color w:val="333333"/>
           <w:sz w:val="21"/>
         </w:rPr>
-        <w:t>One Filter Scope for Every Visual</w:t>
+        <w:t>Refresh Tests and Static Snapshots</w:t>
         <w:tab/>
-        <w:t>51</w:t>
+        <w:t>52</w:t>
       </w:r>
     </w:p>
     <w:p>
@@ -1195,9 +1195,9 @@
           <w:color w:val="333333"/>
           <w:sz w:val="21"/>
         </w:rPr>
-        <w:t>Refresh Tests and Static Snapshots</w:t>
+        <w:t>Lab 8 · Interactive Filters and Refresh — Use the Dashboard Skill for Filters, Refresh and Safe Reruns</w:t>
         <w:tab/>
-        <w:t>52</w:t>
+        <w:t>53</w:t>
       </w:r>
     </w:p>
     <w:p>
@@ -1215,9 +1215,28 @@
           <w:color w:val="333333"/>
           <w:sz w:val="21"/>
         </w:rPr>
-        <w:t>Lab 8 · Interactive Filters and Refresh — Use the Dashboard Skill for Filters, Refresh and Safe Reruns</w:t>
+        <w:t>Topic 3 Recap - Mapped to Learning Outcomes</w:t>
         <w:tab/>
-        <w:t>53</w:t>
+        <w:t>58</w:t>
+      </w:r>
+    </w:p>
+    <w:p>
+      <w:pPr>
+        <w:tabs>
+          <w:tab w:pos="9072" w:val="right" w:leader="dot"/>
+        </w:tabs>
+        <w:spacing w:after="60"/>
+      </w:pPr>
+      <w:r>
+        <w:rPr>
+          <w:rFonts w:ascii="Arial" w:hAnsi="Arial"/>
+          <w:b/>
+          <w:color w:val="333333"/>
+          <w:sz w:val="22"/>
+        </w:rPr>
+        <w:t>Topic 4 — Create a Professional Presentation with PowerPoint Copilot</w:t>
+        <w:tab/>
+        <w:t>58</w:t>
       </w:r>
     </w:p>
     <w:p>
@@ -1235,26 +1254,7 @@
           <w:color w:val="333333"/>
           <w:sz w:val="21"/>
         </w:rPr>
-        <w:t>Topic 3 Recap - Mapped to Learning Outcomes</w:t>
-        <w:tab/>
-        <w:t>58</w:t>
-      </w:r>
-    </w:p>
-    <w:p>
-      <w:pPr>
-        <w:tabs>
-          <w:tab w:pos="9072" w:val="right" w:leader="dot"/>
-        </w:tabs>
-        <w:spacing w:after="60"/>
-      </w:pPr>
-      <w:r>
-        <w:rPr>
-          <w:rFonts w:ascii="Arial" w:hAnsi="Arial"/>
-          <w:b/>
-          <w:color w:val="333333"/>
-          <w:sz w:val="22"/>
-        </w:rPr>
-        <w:t>Topic 4 — Create a Professional Presentation with PowerPoint Copilot</w:t>
+        <w:t>From Dashboard Evidence to a Decision Story</w:t>
         <w:tab/>
         <w:t>58</w:t>
       </w:r>
@@ -1274,9 +1274,9 @@
           <w:color w:val="333333"/>
           <w:sz w:val="21"/>
         </w:rPr>
-        <w:t>From Dashboard Evidence to a Decision Story</w:t>
+        <w:t>Charts, Templates and Source Provenance</w:t>
         <w:tab/>
-        <w:t>58</w:t>
+        <w:t>59</w:t>
       </w:r>
     </w:p>
     <w:p>
@@ -1294,9 +1294,9 @@
           <w:color w:val="333333"/>
           <w:sz w:val="21"/>
         </w:rPr>
-        <w:t>Charts, Templates and Source Provenance</w:t>
+        <w:t>Lab 9 · Dashboard to presentation — Turn Dashboard Evidence into a Management Story</w:t>
         <w:tab/>
-        <w:t>59</w:t>
+        <w:t>60</w:t>
       </w:r>
     </w:p>
     <w:p>
@@ -1314,9 +1314,9 @@
           <w:color w:val="333333"/>
           <w:sz w:val="21"/>
         </w:rPr>
-        <w:t>Lab 9 · Dashboard to presentation — Turn Dashboard Evidence into a Management Story</w:t>
+        <w:t>Professional Refinement and Rehearsal</w:t>
         <w:tab/>
-        <w:t>60</w:t>
+        <w:t>63</w:t>
       </w:r>
     </w:p>
     <w:p>
@@ -1334,9 +1334,9 @@
           <w:color w:val="333333"/>
           <w:sz w:val="21"/>
         </w:rPr>
-        <w:t>Professional Refinement and Rehearsal</w:t>
+        <w:t>Reviewed Handoff and Artifact Lifecycle</w:t>
         <w:tab/>
-        <w:t>63</w:t>
+        <w:t>64</w:t>
       </w:r>
     </w:p>
     <w:p>
@@ -1354,9 +1354,9 @@
           <w:color w:val="333333"/>
           <w:sz w:val="21"/>
         </w:rPr>
-        <w:t>Reviewed Handoff and Artifact Lifecycle</w:t>
+        <w:t>Lab 10 · Professional handoff — Refine and Present the Maintenance Decision Deck</w:t>
         <w:tab/>
-        <w:t>64</w:t>
+        <w:t>65</w:t>
       </w:r>
     </w:p>
     <w:p>
@@ -1374,9 +1374,28 @@
           <w:color w:val="333333"/>
           <w:sz w:val="21"/>
         </w:rPr>
-        <w:t>Lab 10 · Professional handoff — Refine and Present the Maintenance Decision Deck</w:t>
+        <w:t>Topic 4 Recap - Mapped to Learning Outcomes</w:t>
         <w:tab/>
-        <w:t>65</w:t>
+        <w:t>69</w:t>
+      </w:r>
+    </w:p>
+    <w:p>
+      <w:pPr>
+        <w:tabs>
+          <w:tab w:pos="9072" w:val="right" w:leader="dot"/>
+        </w:tabs>
+        <w:spacing w:after="60"/>
+      </w:pPr>
+      <w:r>
+        <w:rPr>
+          <w:rFonts w:ascii="Arial" w:hAnsi="Arial"/>
+          <w:b/>
+          <w:color w:val="333333"/>
+          <w:sz w:val="22"/>
+        </w:rPr>
+        <w:t>Topic 5 — Copilot Agents and Mini Capstone</w:t>
+        <w:tab/>
+        <w:t>69</w:t>
       </w:r>
     </w:p>
     <w:p>
@@ -1394,26 +1413,7 @@
           <w:color w:val="333333"/>
           <w:sz w:val="21"/>
         </w:rPr>
-        <w:t>Topic 4 Recap - Mapped to Learning Outcomes</w:t>
-        <w:tab/>
-        <w:t>69</w:t>
-      </w:r>
-    </w:p>
-    <w:p>
-      <w:pPr>
-        <w:tabs>
-          <w:tab w:pos="9072" w:val="right" w:leader="dot"/>
-        </w:tabs>
-        <w:spacing w:after="60"/>
-      </w:pPr>
-      <w:r>
-        <w:rPr>
-          <w:rFonts w:ascii="Arial" w:hAnsi="Arial"/>
-          <w:b/>
-          <w:color w:val="333333"/>
-          <w:sz w:val="22"/>
-        </w:rPr>
-        <w:t>Topic 5 — Copilot Agents and Mini Capstone</w:t>
+        <w:t>What Is Agent Builder?</w:t>
         <w:tab/>
         <w:t>69</w:t>
       </w:r>
@@ -1433,9 +1433,9 @@
           <w:color w:val="333333"/>
           <w:sz w:val="21"/>
         </w:rPr>
-        <w:t>What Is Agent Builder?</w:t>
+        <w:t>Lab 11 · Copilot Agent Builder — Build a Work-Order Agent with Agent Builder</w:t>
         <w:tab/>
-        <w:t>69</w:t>
+        <w:t>70</w:t>
       </w:r>
     </w:p>
     <w:p>
@@ -1453,9 +1453,9 @@
           <w:color w:val="333333"/>
           <w:sz w:val="21"/>
         </w:rPr>
-        <w:t>Lab 11 · Copilot Agent Builder — Build a Work-Order Agent with Agent Builder</w:t>
+        <w:t>Mini Capstone: From Your Data to a Decision</w:t>
         <w:tab/>
-        <w:t>70</w:t>
+        <w:t>74</w:t>
       </w:r>
     </w:p>
     <w:p>
@@ -1473,9 +1473,9 @@
           <w:color w:val="333333"/>
           <w:sz w:val="21"/>
         </w:rPr>
-        <w:t>Mini Capstone: From Your Data to a Decision</w:t>
+        <w:t>Lab 12 · Mini Capstone — Mini Capstone: Group Dashboard and Decision Deck</w:t>
         <w:tab/>
-        <w:t>74</w:t>
+        <w:t>75</w:t>
       </w:r>
     </w:p>
     <w:p>
@@ -1493,9 +1493,9 @@
           <w:color w:val="333333"/>
           <w:sz w:val="21"/>
         </w:rPr>
-        <w:t>Lab 12 · Mini Capstone — Mini Capstone: Group Dashboard and Decision Deck</w:t>
+        <w:t>Topic 5 Recap - Mapped to Learning Outcomes</w:t>
         <w:tab/>
-        <w:t>75</w:t>
+        <w:t>79</w:t>
       </w:r>
     </w:p>
     <w:p>
@@ -1504,18 +1504,17 @@
           <w:tab w:pos="9072" w:val="right" w:leader="dot"/>
         </w:tabs>
         <w:spacing w:after="60"/>
-        <w:ind w:left="432"/>
       </w:pPr>
       <w:r>
         <w:rPr>
           <w:rFonts w:ascii="Arial" w:hAnsi="Arial"/>
-          <w:b w:val="0"/>
+          <w:b/>
           <w:color w:val="333333"/>
-          <w:sz w:val="21"/>
-        </w:rPr>
-        <w:t>Topic 5 Recap - Mapped to Learning Outcomes</w:t>
+          <w:sz w:val="22"/>
+        </w:rPr>
+        <w:t>Closing: 5 Principles of AI Security</w:t>
         <w:tab/>
-        <w:t>79</w:t>
+        <w:t>80</w:t>
       </w:r>
     </w:p>
     <w:p>
@@ -3507,245 +3506,9 @@
     <w:p/>
     <w:p>
       <w:r>
-        <w:t>Concepts for Lab 2: AI Security: Five Principles, Prompts and Verified App Handoffs, Outlook Drafting and Operational Decisions.</w:t>
-      </w:r>
-    </w:p>
-    <w:p>
-      <w:pPr>
-        <w:pStyle w:val="Heading2"/>
-        <w:keepNext/>
-      </w:pPr>
-      <w:r>
-        <w:t>AI Security: Five Principles</w:t>
-      </w:r>
-    </w:p>
-    <w:p>
-      <w:r>
-        <w:t>AI security is the set of habits and controls that keep data, decisions and systems safe when people work with AI assistants and agents. Five principles apply to every Copilot task in this course: data control, permission control, human in the loop, traceability, and using a well-tested model rather than the newest one for important work.</w:t>
-      </w:r>
-    </w:p>
-    <w:p>
-      <w:pPr>
-        <w:keepNext/>
-      </w:pPr>
-      <w:r>
-        <w:t>Copilot only surfaces data a user can already access and does not use prompts to train its foundation models, but people can still overshare, give an agent too much access, accept an unchecked draft or lose track of what was used. The principles turn those risks into checks you can perform before work leaves your hands.</w:t>
-      </w:r>
-    </w:p>
-    <w:p>
-      <w:pPr>
-        <w:keepNext/>
-      </w:pPr>
-      <w:r>
-        <w:rPr>
-          <w:b/>
-          <w:color w:val="1F6FEB"/>
-          <w:sz w:val="22"/>
-        </w:rPr>
-        <w:t>How it works</w:t>
-      </w:r>
-    </w:p>
-    <w:p>
-      <w:pPr>
-        <w:pStyle w:val="ListBullet"/>
-      </w:pPr>
-      <w:r>
-        <w:t>Share only the data the task needs.</w:t>
-      </w:r>
-    </w:p>
-    <w:p>
-      <w:pPr>
-        <w:pStyle w:val="ListBullet"/>
-      </w:pPr>
-      <w:r>
-        <w:t>Limit access for people, agents and skills.</w:t>
-      </w:r>
-    </w:p>
-    <w:p>
-      <w:pPr>
-        <w:pStyle w:val="ListBullet"/>
-      </w:pPr>
-      <w:r>
-        <w:t>Review and approve before anything takes effect.</w:t>
-      </w:r>
-    </w:p>
-    <w:p>
-      <w:pPr>
-        <w:pStyle w:val="ListBullet"/>
-      </w:pPr>
-      <w:r>
-        <w:t>Log sources, prompts, versions and checks.</w:t>
-      </w:r>
-    </w:p>
-    <w:p>
-      <w:pPr>
-        <w:keepNext/>
-      </w:pPr>
-      <w:r>
-        <w:rPr>
-          <w:b/>
-          <w:color w:val="1F6FEB"/>
-          <w:sz w:val="22"/>
-        </w:rPr>
-        <w:t>Worked example</w:t>
-      </w:r>
-    </w:p>
-    <w:p>
-      <w:pPr>
-        <w:pStyle w:val="ListBullet"/>
-      </w:pPr>
-      <w:r>
-        <w:t>Use synthetic or sanitised data in training and demos.</w:t>
-      </w:r>
-    </w:p>
-    <w:p>
-      <w:pPr>
-        <w:pStyle w:val="ListBullet"/>
-      </w:pPr>
-      <w:r>
-        <w:t>An agent gets Can chat access, not Can edit, unless needed.</w:t>
-      </w:r>
-    </w:p>
-    <w:p>
-      <w:pPr>
-        <w:pStyle w:val="ListBullet"/>
-      </w:pPr>
-      <w:r>
-        <w:t>A Copilot email stays a draft until a person reviews it.</w:t>
-      </w:r>
-    </w:p>
-    <w:p>
-      <w:pPr>
-        <w:keepNext/>
-      </w:pPr>
-      <w:r>
-        <w:rPr>
-          <w:b/>
-          <w:color w:val="1F6FEB"/>
-          <w:sz w:val="22"/>
-        </w:rPr>
-        <w:t>Decision guide</w:t>
-      </w:r>
-    </w:p>
-    <w:tbl>
-      <w:tblPr>
-        <w:tblStyle w:val="TableGrid"/>
-        <w:tblW w:type="auto" w:w="0"/>
-        <w:tblLook w:firstColumn="1" w:firstRow="1" w:lastColumn="0" w:lastRow="0" w:noHBand="0" w:noVBand="1" w:val="04A0"/>
-      </w:tblPr>
-      <w:tblGrid>
-        <w:gridCol w:w="4320"/>
-        <w:gridCol w:w="4320"/>
-      </w:tblGrid>
-      <w:tr>
-        <w:trPr>
-          <w:tblHeader w:val="true"/>
-          <w:cantSplit/>
-        </w:trPr>
-        <w:tc>
-          <w:tcPr>
-            <w:tcW w:type="dxa" w:w="4320"/>
-            <w:shd w:val="clear" w:color="auto" w:fill="E8F0FE"/>
-          </w:tcPr>
-          <w:p>
-            <w:pPr>
-              <w:keepNext/>
-            </w:pPr>
-            <w:r/>
-            <w:r>
-              <w:rPr>
-                <w:b/>
-                <w:sz w:val="19"/>
-              </w:rPr>
-              <w:t>Use when</w:t>
-            </w:r>
-          </w:p>
-        </w:tc>
-        <w:tc>
-          <w:tcPr>
-            <w:tcW w:type="dxa" w:w="4320"/>
-            <w:shd w:val="clear" w:color="auto" w:fill="E8F0FE"/>
-          </w:tcPr>
-          <w:p>
-            <w:pPr>
-              <w:keepNext/>
-            </w:pPr>
-            <w:r/>
-            <w:r>
-              <w:rPr>
-                <w:b/>
-                <w:sz w:val="19"/>
-              </w:rPr>
-              <w:t>Avoid when</w:t>
-            </w:r>
-          </w:p>
-        </w:tc>
-      </w:tr>
-      <w:tr>
-        <w:trPr>
-          <w:cantSplit/>
-        </w:trPr>
-        <w:tc>
-          <w:tcPr>
-            <w:tcW w:type="dxa" w:w="4320"/>
-          </w:tcPr>
-          <w:p>
-            <w:r/>
-            <w:r>
-              <w:rPr>
-                <w:sz w:val="19"/>
-              </w:rPr>
-              <w:t>The output could reach other people, systems or decisions.</w:t>
-            </w:r>
-          </w:p>
-        </w:tc>
-        <w:tc>
-          <w:tcPr>
-            <w:tcW w:type="dxa" w:w="4320"/>
-          </w:tcPr>
-          <w:p>
-            <w:r/>
-            <w:r>
-              <w:rPr>
-                <w:sz w:val="19"/>
-              </w:rPr>
-              <w:t>Confidential data is pasted into an unapproved tool or a draft is sent unchecked.</w:t>
-            </w:r>
-          </w:p>
-        </w:tc>
-      </w:tr>
-    </w:tbl>
-    <w:p/>
-    <w:p>
-      <w:pPr>
-        <w:keepNext/>
-      </w:pPr>
-      <w:r>
-        <w:rPr>
-          <w:b/>
-          <w:color w:val="1F6FEB"/>
-          <w:sz w:val="22"/>
-        </w:rPr>
-        <w:t>Authoritative references</w:t>
-      </w:r>
-    </w:p>
-    <w:p>
-      <w:pPr>
-        <w:pStyle w:val="ListBullet"/>
-      </w:pPr>
-      <w:r>
-        <w:t>https://learn.microsoft.com/en-us/microsoft-365/copilot/microsoft-365-copilot-privacy</w:t>
-      </w:r>
-    </w:p>
-    <w:p>
-      <w:pPr>
-        <w:pStyle w:val="ListBullet"/>
-      </w:pPr>
-      <w:r>
-        <w:t>https://learn.microsoft.com/en-us/microsoft-365/copilot/microsoft-365-copilot-overview</w:t>
-      </w:r>
-    </w:p>
-    <w:p/>
+        <w:t>Concepts for Lab 2: Prompts and Verified App Handoffs, Outlook Drafting and Operational Decisions.</w:t>
+      </w:r>
+    </w:p>
     <w:p>
       <w:pPr>
         <w:pStyle w:val="Heading2"/>
@@ -21031,6 +20794,198 @@
       </w:tr>
     </w:tbl>
     <w:p/>
+    <w:p/>
+    <w:p>
+      <w:pPr>
+        <w:pStyle w:val="Heading1"/>
+        <w:keepNext/>
+      </w:pPr>
+      <w:r>
+        <w:t>Closing: 5 Principles of AI Security</w:t>
+      </w:r>
+    </w:p>
+    <w:p>
+      <w:pPr>
+        <w:keepNext/>
+      </w:pPr>
+      <w:r>
+        <w:t>AI security is the set of habits and controls that keep data, decisions and systems safe when people work with AI assistants and agents. Five principles apply to every Copilot task in this course: data control, permission control, human in the loop, traceability, and using a well-tested model rather than the newest one for important work. Copilot only surfaces data a user can already access and does not use prompts to train its foundation models, but people can still overshare, give an agent too much access, accept an unchecked draft or lose track of what was used. The principles turn those risks into checks you can perform before work leaves your hands.</w:t>
+      </w:r>
+    </w:p>
+    <w:p>
+      <w:pPr>
+        <w:keepNext/>
+      </w:pPr>
+      <w:r>
+        <w:rPr>
+          <w:b/>
+          <w:color w:val="1F6FEB"/>
+          <w:sz w:val="22"/>
+        </w:rPr>
+        <w:t>Data control</w:t>
+      </w:r>
+    </w:p>
+    <w:p>
+      <w:pPr>
+        <w:keepNext/>
+      </w:pPr>
+      <w:r>
+        <w:t>Share only what the task needs; use synthetic or sanitised data.</w:t>
+      </w:r>
+    </w:p>
+    <w:p>
+      <w:pPr>
+        <w:keepNext/>
+      </w:pPr>
+      <w:r>
+        <w:rPr>
+          <w:b/>
+          <w:color w:val="1F6FEB"/>
+          <w:sz w:val="22"/>
+        </w:rPr>
+        <w:t>Permission control</w:t>
+      </w:r>
+    </w:p>
+    <w:p>
+      <w:pPr>
+        <w:keepNext/>
+      </w:pPr>
+      <w:r>
+        <w:t>Least privilege for files, agents, skills and sharing.</w:t>
+      </w:r>
+    </w:p>
+    <w:p>
+      <w:pPr>
+        <w:keepNext/>
+      </w:pPr>
+      <w:r>
+        <w:rPr>
+          <w:b/>
+          <w:color w:val="1F6FEB"/>
+          <w:sz w:val="22"/>
+        </w:rPr>
+        <w:t>Human in the loop</w:t>
+      </w:r>
+    </w:p>
+    <w:p>
+      <w:pPr>
+        <w:keepNext/>
+      </w:pPr>
+      <w:r>
+        <w:t>Plan, review and approve before edits, emails or decisions.</w:t>
+      </w:r>
+    </w:p>
+    <w:p>
+      <w:pPr>
+        <w:keepNext/>
+      </w:pPr>
+      <w:r>
+        <w:rPr>
+          <w:b/>
+          <w:color w:val="1F6FEB"/>
+          <w:sz w:val="22"/>
+        </w:rPr>
+        <w:t>Traceability</w:t>
+      </w:r>
+    </w:p>
+    <w:p>
+      <w:pPr>
+        <w:keepNext/>
+      </w:pPr>
+      <w:r>
+        <w:t>Log prompts, sources, versions and checks for every output.</w:t>
+      </w:r>
+    </w:p>
+    <w:p>
+      <w:pPr>
+        <w:keepNext/>
+      </w:pPr>
+      <w:r>
+        <w:rPr>
+          <w:b/>
+          <w:color w:val="1F6FEB"/>
+          <w:sz w:val="22"/>
+        </w:rPr>
+        <w:t>Well-tested models</w:t>
+      </w:r>
+    </w:p>
+    <w:p>
+      <w:pPr>
+        <w:keepNext/>
+      </w:pPr>
+      <w:r>
+        <w:t>Prefer proven, approved models over the newest release.</w:t>
+      </w:r>
+    </w:p>
+    <w:p>
+      <w:pPr>
+        <w:keepNext/>
+      </w:pPr>
+      <w:r>
+        <w:rPr>
+          <w:b/>
+          <w:color w:val="1F6FEB"/>
+          <w:sz w:val="22"/>
+        </w:rPr>
+        <w:t>Put the principles into practice</w:t>
+      </w:r>
+    </w:p>
+    <w:p>
+      <w:pPr>
+        <w:pStyle w:val="ListBullet"/>
+      </w:pPr>
+      <w:r>
+        <w:t>Share only the data the task needs.</w:t>
+      </w:r>
+    </w:p>
+    <w:p>
+      <w:pPr>
+        <w:pStyle w:val="ListBullet"/>
+      </w:pPr>
+      <w:r>
+        <w:t>Limit access for people, agents and skills.</w:t>
+      </w:r>
+    </w:p>
+    <w:p>
+      <w:pPr>
+        <w:pStyle w:val="ListBullet"/>
+      </w:pPr>
+      <w:r>
+        <w:t>Review and approve before anything takes effect.</w:t>
+      </w:r>
+    </w:p>
+    <w:p>
+      <w:pPr>
+        <w:pStyle w:val="ListBullet"/>
+      </w:pPr>
+      <w:r>
+        <w:t>Log sources, prompts, versions and checks.</w:t>
+      </w:r>
+    </w:p>
+    <w:p>
+      <w:pPr>
+        <w:pStyle w:val="ListBullet"/>
+      </w:pPr>
+      <w:r>
+        <w:t>Use synthetic or sanitised data in training and demos.</w:t>
+      </w:r>
+    </w:p>
+    <w:p>
+      <w:pPr>
+        <w:pStyle w:val="ListBullet"/>
+      </w:pPr>
+      <w:r>
+        <w:t>An agent gets Can chat access, not Can edit, unless needed.</w:t>
+      </w:r>
+    </w:p>
+    <w:p>
+      <w:pPr>
+        <w:pStyle w:val="ListBullet"/>
+      </w:pPr>
+      <w:r>
+        <w:t>A Copilot email stays a draft until a person reviews it.</w:t>
+      </w:r>
+    </w:p>
     <w:p/>
     <w:p>
       <w:r>

</xml_diff>

<commit_message>
feat: add PowerPoint design-skill lab, failure-mode Pareto and new slides
- New Lab 7: create northstar-deck-design, a PowerPoint skill that turns
  a plain deck into a branded, professional one (Segoe UI, navy header
  bar, KPI cards, footer). Ships a plain 6-slide deck and a reference
  SKILL.md. Former Labs 7-12 are renumbered 8-13; LP timetable, LG,
  deck, prompts page and lab folders follow the new sequence.
- Work orders now record a Failure_Mode. Lab 5 builds a Pareto of the
  vital few failure modes (3 of 8 = 78%); Lab 6 installs both the
  Pareto and reporting skills and adds the Pareto to the report.
- Deck: "Copilot: One Agentic AI Interface, Four Tools" hub diagram
  before Topic 1, and "Anatomy of a Skill" (on-demand trigger, name and
  description metadata, steps, reference files) before the skill labs.

Co-Authored-By: Claude Opus 5.5 <noreply@anthropic.com>
</commit_message>
<xml_diff>
--- a/courseware/LG-GenAI for Engineers.docx
+++ b/courseware/LG-GenAI for Engineers.docx
@@ -256,7 +256,7 @@
               <w:rPr>
                 <w:sz w:val="19"/>
               </w:rPr>
-              <w:t>Simple, self-contained labs: short steps with one prompt each, and every lab works directly on the files in its own lab folder (no extra folder, no copying, no dependence on earlier labs); files stay local with no OneDrive upload; Word, PowerPoint and Outlook steps upload the local file with + &gt; Upload images and files (paste as fallback); new slide compares local upload with OneDrive / reference. OneDrive remains only for the Excel Skills folder and Agent Builder knowledge.</w:t>
+              <w:t>Simple, self-contained labs: short steps with one prompt each, and every lab works directly on the files in its own lab folder (no extra folder, no copying, no dependence on earlier labs); files stay local with no OneDrive upload; new Lab 7 PowerPoint design skill (plain to professional deck); Failure_Mode column and failure-mode Pareto in Labs 5-6; slides on Copilot as the agentic AI interface and on SKILL.md anatomy; Word, PowerPoint and Outlook steps upload the local file with + &gt; Upload images and files (paste as fallback); new slide compares local upload with OneDrive / reference. OneDrive remains only for the Excel Skills folder and Agent Builder knowledge.</w:t>
             </w:r>
           </w:p>
         </w:tc>
@@ -934,7 +934,7 @@
           <w:color w:val="333333"/>
           <w:sz w:val="21"/>
         </w:rPr>
-        <w:t>Built-in and Custom Skills</w:t>
+        <w:t>What Is a Skill? Inside SKILL.md</w:t>
         <w:tab/>
         <w:t>24</w:t>
       </w:r>
@@ -954,7 +954,7 @@
           <w:color w:val="333333"/>
           <w:sz w:val="21"/>
         </w:rPr>
-        <w:t>Pareto Skill: Counts, Sorting and Cumulative Share</w:t>
+        <w:t>Built-in and Custom Skills</w:t>
         <w:tab/>
         <w:t>25</w:t>
       </w:r>
@@ -974,7 +974,7 @@
           <w:color w:val="333333"/>
           <w:sz w:val="21"/>
         </w:rPr>
-        <w:t>Lab 5 · Custom Pareto Chart Skill — Use the Built-in Chart Skill, then Create a Custom Pareto Skill</w:t>
+        <w:t>Pareto Skill: Find the Vital Few Failure Modes</w:t>
         <w:tab/>
         <w:t>26</w:t>
       </w:r>
@@ -994,9 +994,9 @@
           <w:color w:val="333333"/>
           <w:sz w:val="21"/>
         </w:rPr>
-        <w:t>Skills, Prompts and Workbook Rules</w:t>
+        <w:t>Lab 5 · Custom Pareto Chart Skill — Find the Vital Few Failure Modes with a Pareto Skill</w:t>
         <w:tab/>
-        <w:t>28</w:t>
+        <w:t>27</w:t>
       </w:r>
     </w:p>
     <w:p>
@@ -1014,7 +1014,7 @@
           <w:color w:val="333333"/>
           <w:sz w:val="21"/>
         </w:rPr>
-        <w:t>Custom Skill Discovery in Each App</w:t>
+        <w:t>Skills, Prompts and Workbook Rules</w:t>
         <w:tab/>
         <w:t>29</w:t>
       </w:r>
@@ -1034,7 +1034,7 @@
           <w:color w:val="333333"/>
           <w:sz w:val="21"/>
         </w:rPr>
-        <w:t>Repeatability and Safe Skill Reruns</w:t>
+        <w:t>Custom Skill Discovery in Each App</w:t>
         <w:tab/>
         <w:t>30</w:t>
       </w:r>
@@ -1054,7 +1054,7 @@
           <w:color w:val="333333"/>
           <w:sz w:val="21"/>
         </w:rPr>
-        <w:t>Assignment Proposals and Capacity Evidence</w:t>
+        <w:t>Repeatability and Safe Skill Reruns</w:t>
         <w:tab/>
         <w:t>31</w:t>
       </w:r>
@@ -1074,7 +1074,7 @@
           <w:color w:val="333333"/>
           <w:sz w:val="21"/>
         </w:rPr>
-        <w:t>Lab 6 · Reporting Skill — Create, Use and Improve the Maintenance Reporting Skill</w:t>
+        <w:t>Assignment Proposals and Capacity Evidence</w:t>
         <w:tab/>
         <w:t>32</w:t>
       </w:r>
@@ -1094,28 +1094,9 @@
           <w:color w:val="333333"/>
           <w:sz w:val="21"/>
         </w:rPr>
-        <w:t>Topic 2 Recap - Mapped to Learning Outcomes</w:t>
+        <w:t>Lab 6 · Reporting Skill — Build a Maintenance Report with Two Skills</w:t>
         <w:tab/>
-        <w:t>35</w:t>
-      </w:r>
-    </w:p>
-    <w:p>
-      <w:pPr>
-        <w:tabs>
-          <w:tab w:pos="9072" w:val="right" w:leader="dot"/>
-        </w:tabs>
-        <w:spacing w:after="60"/>
-      </w:pPr>
-      <w:r>
-        <w:rPr>
-          <w:rFonts w:ascii="Arial" w:hAnsi="Arial"/>
-          <w:b/>
-          <w:color w:val="333333"/>
-          <w:sz w:val="22"/>
-        </w:rPr>
-        <w:t>Topic 3 — Interactive Dashboards with Custom Skills</w:t>
-        <w:tab/>
-        <w:t>35</w:t>
+        <w:t>33</w:t>
       </w:r>
     </w:p>
     <w:p>
@@ -1133,9 +1114,9 @@
           <w:color w:val="333333"/>
           <w:sz w:val="21"/>
         </w:rPr>
-        <w:t>Custom Dashboard Skill as a Reusable Contract</w:t>
+        <w:t>PowerPoint Design Skill: From Plain to Professional</w:t>
         <w:tab/>
-        <w:t>35</w:t>
+        <w:t>36</w:t>
       </w:r>
     </w:p>
     <w:p>
@@ -1153,9 +1134,9 @@
           <w:color w:val="333333"/>
           <w:sz w:val="21"/>
         </w:rPr>
-        <w:t>Dashboard Measures and Denominators</w:t>
+        <w:t>Lab 7 · PowerPoint Design Skill — Create a PowerPoint Design Skill: From Plain to Professional</w:t>
         <w:tab/>
-        <w:t>36</w:t>
+        <w:t>37</w:t>
       </w:r>
     </w:p>
     <w:p>
@@ -1173,9 +1154,28 @@
           <w:color w:val="333333"/>
           <w:sz w:val="21"/>
         </w:rPr>
-        <w:t>Visual Dashboard Design for Maintenance</w:t>
+        <w:t>Topic 2 Recap - Mapped to Learning Outcomes</w:t>
         <w:tab/>
-        <w:t>37</w:t>
+        <w:t>39</w:t>
+      </w:r>
+    </w:p>
+    <w:p>
+      <w:pPr>
+        <w:tabs>
+          <w:tab w:pos="9072" w:val="right" w:leader="dot"/>
+        </w:tabs>
+        <w:spacing w:after="60"/>
+      </w:pPr>
+      <w:r>
+        <w:rPr>
+          <w:rFonts w:ascii="Arial" w:hAnsi="Arial"/>
+          <w:b/>
+          <w:color w:val="333333"/>
+          <w:sz w:val="22"/>
+        </w:rPr>
+        <w:t>Topic 3 — Interactive Dashboards with Custom Skills</w:t>
+        <w:tab/>
+        <w:t>40</w:t>
       </w:r>
     </w:p>
     <w:p>
@@ -1193,9 +1193,9 @@
           <w:color w:val="333333"/>
           <w:sz w:val="21"/>
         </w:rPr>
-        <w:t>Lab 7 · Custom Dashboard Skill — Create and Apply a Custom Interactive Dashboard Skill</w:t>
+        <w:t>Custom Dashboard Skill as a Reusable Contract</w:t>
         <w:tab/>
-        <w:t>38</w:t>
+        <w:t>40</w:t>
       </w:r>
     </w:p>
     <w:p>
@@ -1213,7 +1213,7 @@
           <w:color w:val="333333"/>
           <w:sz w:val="21"/>
         </w:rPr>
-        <w:t>One Filter Scope for Every Visual</w:t>
+        <w:t>Dashboard Measures and Denominators</w:t>
         <w:tab/>
         <w:t>41</w:t>
       </w:r>
@@ -1233,7 +1233,7 @@
           <w:color w:val="333333"/>
           <w:sz w:val="21"/>
         </w:rPr>
-        <w:t>Refresh Tests and Static Snapshots</w:t>
+        <w:t>Visual Dashboard Design for Maintenance</w:t>
         <w:tab/>
         <w:t>42</w:t>
       </w:r>
@@ -1253,7 +1253,7 @@
           <w:color w:val="333333"/>
           <w:sz w:val="21"/>
         </w:rPr>
-        <w:t>Lab 8 · Interactive Filters and Refresh — Test Dashboard Filters and a Data Refresh</w:t>
+        <w:t>Lab 8 · Custom Dashboard Skill — Build an Interactive Dashboard with a Custom Skill</w:t>
         <w:tab/>
         <w:t>42</w:t>
       </w:r>
@@ -1273,26 +1273,7 @@
           <w:color w:val="333333"/>
           <w:sz w:val="21"/>
         </w:rPr>
-        <w:t>Topic 3 Recap - Mapped to Learning Outcomes</w:t>
-        <w:tab/>
-        <w:t>45</w:t>
-      </w:r>
-    </w:p>
-    <w:p>
-      <w:pPr>
-        <w:tabs>
-          <w:tab w:pos="9072" w:val="right" w:leader="dot"/>
-        </w:tabs>
-        <w:spacing w:after="60"/>
-      </w:pPr>
-      <w:r>
-        <w:rPr>
-          <w:rFonts w:ascii="Arial" w:hAnsi="Arial"/>
-          <w:b/>
-          <w:color w:val="333333"/>
-          <w:sz w:val="22"/>
-        </w:rPr>
-        <w:t>Topic 4 — Create a Professional Presentation with PowerPoint Copilot</w:t>
+        <w:t>One Filter Scope for Every Visual</w:t>
         <w:tab/>
         <w:t>45</w:t>
       </w:r>
@@ -1312,9 +1293,9 @@
           <w:color w:val="333333"/>
           <w:sz w:val="21"/>
         </w:rPr>
-        <w:t>From Dashboard Evidence to a Decision Story</w:t>
+        <w:t>Refresh Tests and Static Snapshots</w:t>
         <w:tab/>
-        <w:t>45</w:t>
+        <w:t>46</w:t>
       </w:r>
     </w:p>
     <w:p>
@@ -1332,7 +1313,7 @@
           <w:color w:val="333333"/>
           <w:sz w:val="21"/>
         </w:rPr>
-        <w:t>Charts, Templates and Source Provenance</w:t>
+        <w:t>Lab 9 · Interactive Filters and Refresh — Test Dashboard Filters and a Data Refresh</w:t>
         <w:tab/>
         <w:t>46</w:t>
       </w:r>
@@ -1352,9 +1333,28 @@
           <w:color w:val="333333"/>
           <w:sz w:val="21"/>
         </w:rPr>
-        <w:t>Lab 9 · Dashboard to presentation — Turn Dashboard Evidence into a Management Story</w:t>
+        <w:t>Topic 3 Recap - Mapped to Learning Outcomes</w:t>
         <w:tab/>
-        <w:t>47</w:t>
+        <w:t>49</w:t>
+      </w:r>
+    </w:p>
+    <w:p>
+      <w:pPr>
+        <w:tabs>
+          <w:tab w:pos="9072" w:val="right" w:leader="dot"/>
+        </w:tabs>
+        <w:spacing w:after="60"/>
+      </w:pPr>
+      <w:r>
+        <w:rPr>
+          <w:rFonts w:ascii="Arial" w:hAnsi="Arial"/>
+          <w:b/>
+          <w:color w:val="333333"/>
+          <w:sz w:val="22"/>
+        </w:rPr>
+        <w:t>Topic 4 — Create a Professional Presentation with PowerPoint Copilot</w:t>
+        <w:tab/>
+        <w:t>49</w:t>
       </w:r>
     </w:p>
     <w:p>
@@ -1372,9 +1372,9 @@
           <w:color w:val="333333"/>
           <w:sz w:val="21"/>
         </w:rPr>
-        <w:t>Professional Refinement and Rehearsal</w:t>
+        <w:t>From Dashboard Evidence to a Decision Story</w:t>
         <w:tab/>
-        <w:t>50</w:t>
+        <w:t>49</w:t>
       </w:r>
     </w:p>
     <w:p>
@@ -1392,7 +1392,7 @@
           <w:color w:val="333333"/>
           <w:sz w:val="21"/>
         </w:rPr>
-        <w:t>Reviewed Handoff and Artifact Lifecycle</w:t>
+        <w:t>Charts, Templates and Source Provenance</w:t>
         <w:tab/>
         <w:t>50</w:t>
       </w:r>
@@ -1412,7 +1412,7 @@
           <w:color w:val="333333"/>
           <w:sz w:val="21"/>
         </w:rPr>
-        <w:t>Lab 10 · Professional handoff — Refine and Present the Maintenance Decision Deck</w:t>
+        <w:t>Lab 10 · Dashboard to presentation — Turn Dashboard Evidence into a Management Story</w:t>
         <w:tab/>
         <w:t>51</w:t>
       </w:r>
@@ -1432,26 +1432,7 @@
           <w:color w:val="333333"/>
           <w:sz w:val="21"/>
         </w:rPr>
-        <w:t>Topic 4 Recap - Mapped to Learning Outcomes</w:t>
-        <w:tab/>
-        <w:t>54</w:t>
-      </w:r>
-    </w:p>
-    <w:p>
-      <w:pPr>
-        <w:tabs>
-          <w:tab w:pos="9072" w:val="right" w:leader="dot"/>
-        </w:tabs>
-        <w:spacing w:after="60"/>
-      </w:pPr>
-      <w:r>
-        <w:rPr>
-          <w:rFonts w:ascii="Arial" w:hAnsi="Arial"/>
-          <w:b/>
-          <w:color w:val="333333"/>
-          <w:sz w:val="22"/>
-        </w:rPr>
-        <w:t>Topic 5 — Copilot Agents and Mini Capstone</w:t>
+        <w:t>Professional Refinement and Rehearsal</w:t>
         <w:tab/>
         <w:t>54</w:t>
       </w:r>
@@ -1471,7 +1452,7 @@
           <w:color w:val="333333"/>
           <w:sz w:val="21"/>
         </w:rPr>
-        <w:t>What Is Agent Builder?</w:t>
+        <w:t>Reviewed Handoff and Artifact Lifecycle</w:t>
         <w:tab/>
         <w:t>54</w:t>
       </w:r>
@@ -1491,7 +1472,7 @@
           <w:color w:val="333333"/>
           <w:sz w:val="21"/>
         </w:rPr>
-        <w:t>Lab 11 · Copilot Agent Builder — Build a Work-Order Agent with Agent Builder</w:t>
+        <w:t>Lab 11 · Professional handoff — Refine and Present the Maintenance Decision Deck</w:t>
         <w:tab/>
         <w:t>55</w:t>
       </w:r>
@@ -1511,7 +1492,26 @@
           <w:color w:val="333333"/>
           <w:sz w:val="21"/>
         </w:rPr>
-        <w:t>Mini Capstone: From Your Data to a Decision</w:t>
+        <w:t>Topic 4 Recap - Mapped to Learning Outcomes</w:t>
+        <w:tab/>
+        <w:t>58</w:t>
+      </w:r>
+    </w:p>
+    <w:p>
+      <w:pPr>
+        <w:tabs>
+          <w:tab w:pos="9072" w:val="right" w:leader="dot"/>
+        </w:tabs>
+        <w:spacing w:after="60"/>
+      </w:pPr>
+      <w:r>
+        <w:rPr>
+          <w:rFonts w:ascii="Arial" w:hAnsi="Arial"/>
+          <w:b/>
+          <w:color w:val="333333"/>
+          <w:sz w:val="22"/>
+        </w:rPr>
+        <w:t>Topic 5 — Copilot Agents and Mini Capstone</w:t>
         <w:tab/>
         <w:t>58</w:t>
       </w:r>
@@ -1531,9 +1531,9 @@
           <w:color w:val="333333"/>
           <w:sz w:val="21"/>
         </w:rPr>
-        <w:t>Lab 12 · Mini Capstone — Mini Capstone: Group Dashboard and Decision Deck</w:t>
+        <w:t>What Is Agent Builder?</w:t>
         <w:tab/>
-        <w:t>59</w:t>
+        <w:t>58</w:t>
       </w:r>
     </w:p>
     <w:p>
@@ -1551,9 +1551,9 @@
           <w:color w:val="333333"/>
           <w:sz w:val="21"/>
         </w:rPr>
-        <w:t>Topic 5 Recap - Mapped to Learning Outcomes</w:t>
+        <w:t>Lab 12 · Copilot Agent Builder — Build a Work-Order Agent with Agent Builder</w:t>
         <w:tab/>
-        <w:t>61</w:t>
+        <w:t>59</w:t>
       </w:r>
     </w:p>
     <w:p>
@@ -1562,6 +1562,66 @@
           <w:tab w:pos="9072" w:val="right" w:leader="dot"/>
         </w:tabs>
         <w:spacing w:after="60"/>
+        <w:ind w:left="432"/>
+      </w:pPr>
+      <w:r>
+        <w:rPr>
+          <w:rFonts w:ascii="Arial" w:hAnsi="Arial"/>
+          <w:b w:val="0"/>
+          <w:color w:val="333333"/>
+          <w:sz w:val="21"/>
+        </w:rPr>
+        <w:t>Mini Capstone: From Your Data to a Decision</w:t>
+        <w:tab/>
+        <w:t>62</w:t>
+      </w:r>
+    </w:p>
+    <w:p>
+      <w:pPr>
+        <w:tabs>
+          <w:tab w:pos="9072" w:val="right" w:leader="dot"/>
+        </w:tabs>
+        <w:spacing w:after="60"/>
+        <w:ind w:left="432"/>
+      </w:pPr>
+      <w:r>
+        <w:rPr>
+          <w:rFonts w:ascii="Arial" w:hAnsi="Arial"/>
+          <w:b w:val="0"/>
+          <w:color w:val="333333"/>
+          <w:sz w:val="21"/>
+        </w:rPr>
+        <w:t>Lab 13 · Mini Capstone — Mini Capstone: Group Dashboard and Decision Deck</w:t>
+        <w:tab/>
+        <w:t>63</w:t>
+      </w:r>
+    </w:p>
+    <w:p>
+      <w:pPr>
+        <w:tabs>
+          <w:tab w:pos="9072" w:val="right" w:leader="dot"/>
+        </w:tabs>
+        <w:spacing w:after="60"/>
+        <w:ind w:left="432"/>
+      </w:pPr>
+      <w:r>
+        <w:rPr>
+          <w:rFonts w:ascii="Arial" w:hAnsi="Arial"/>
+          <w:b w:val="0"/>
+          <w:color w:val="333333"/>
+          <w:sz w:val="21"/>
+        </w:rPr>
+        <w:t>Topic 5 Recap - Mapped to Learning Outcomes</w:t>
+        <w:tab/>
+        <w:t>65</w:t>
+      </w:r>
+    </w:p>
+    <w:p>
+      <w:pPr>
+        <w:tabs>
+          <w:tab w:pos="9072" w:val="right" w:leader="dot"/>
+        </w:tabs>
+        <w:spacing w:after="60"/>
       </w:pPr>
       <w:r>
         <w:rPr>
@@ -1572,7 +1632,7 @@
         </w:rPr>
         <w:t>Closing: 5 Principles of AI Security</w:t>
         <w:tab/>
-        <w:t>62</w:t>
+        <w:t>66</w:t>
       </w:r>
     </w:p>
     <w:p>
@@ -1591,7 +1651,7 @@
         </w:rPr>
         <w:t>Next Steps</w:t>
         <w:tab/>
-        <w:t>63</w:t>
+        <w:t>67</w:t>
       </w:r>
     </w:p>
     <w:p>
@@ -1610,7 +1670,7 @@
         </w:rPr>
         <w:t>Glossary</w:t>
         <w:tab/>
-        <w:t>63</w:t>
+        <w:t>67</w:t>
       </w:r>
     </w:p>
     <w:p>
@@ -1634,7 +1694,7 @@
     </w:p>
     <w:p>
       <w:r>
-        <w:t>Study each topic’s concepts before its connected labs. Topic 2 has four labs; Topics 1, 3 and 4 have two each; Topic 5 has the agent lab and the group mini capstone. Each lab has its own instruction PDF and a lean data folder: the lab workbook and only the templates that lab uses. Copy-ready prompts are on the linked web page, step by step. Every lab is self-contained: work directly on the files in its own data folder, so you can start any lab without finishing the one before. The detailed procedures are here and in labs; the slides teach concepts and show outcomes.</w:t>
+        <w:t>Study each topic’s concepts before its connected labs. Topic 2 has five labs; Topics 1, 3 and 4 have two each; Topic 5 has the agent lab and the group mini capstone. Each lab has its own instruction PDF and a lean data folder: the lab workbook and only the templates that lab uses. Copy-ready prompts are on the linked web page, step by step. Every lab is self-contained: work directly on the files in its own data folder, so you can start any lab without finishing the one before. The detailed procedures are here and in labs; the slides teach concepts and show outcomes.</w:t>
       </w:r>
     </w:p>
     <w:p>
@@ -7325,7 +7385,7 @@
     <w:p/>
     <w:p>
       <w:r>
-        <w:t>Concepts for Lab 5: Built-in and Custom Skills, Pareto Skill: Counts, Sorting and Cumulative Share.</w:t>
+        <w:t>Concepts for Lab 5: What Is a Skill? Inside SKILL.md, Built-in and Custom Skills, Pareto Skill: Find the Vital Few Failure Modes.</w:t>
       </w:r>
     </w:p>
     <w:p>
@@ -7334,20 +7394,20 @@
         <w:keepNext/>
       </w:pPr>
       <w:r>
-        <w:t>Built-in and Custom Skills</w:t>
-      </w:r>
-    </w:p>
-    <w:p>
-      <w:r>
-        <w:t>Copilot in Excel ships with built-in skills you call with @, such as @chart-design for charts. @chart-design applies the Excel design team’s chart guidance and @theme-design handles workbook formatting. Built-in skills are turned on in Settings (...) &gt; Manage plugins &amp; skills; chart-design sits under Visualization and is off by default. A custom skill is your own SKILL.md for a method Excel does not know, such as the water-service Pareto or dashboard.</w:t>
-      </w:r>
-    </w:p>
-    <w:p>
-      <w:pPr>
-        <w:keepNext/>
-      </w:pPr>
-      <w:r>
-        <w:t>Start with a built-in skill when the task is generic, such as making a clear chart. Write a custom skill when the method carries your own rules: which rows count, how ties sort, which outputs may be replaced and which checks must pass. Both are reusable; only the custom one knows Northstar.</w:t>
+        <w:t>What Is a Skill? Inside SKILL.md</w:t>
+      </w:r>
+    </w:p>
+    <w:p>
+      <w:r>
+        <w:t>A skill is a folder with a SKILL.md file. The file starts with metadata between two --- lines: a name, which must match the folder name, and a description that says when to use the skill. The body below it holds the steps and procedure Copilot follows. The folder can also hold reference files, such as a template, an example or a data list, that the steps point to.</w:t>
+      </w:r>
+    </w:p>
+    <w:p>
+      <w:pPr>
+        <w:keepNext/>
+      </w:pPr>
+      <w:r>
+        <w:t>Skills are triggered on demand: Copilot reads a skill only when you call it with @name or your request matches its description, so skills do not crowd every chat. Write a method once, install it once, and it runs the same way in every file. Excel and PowerPoint both use this format.</w:t>
       </w:r>
     </w:p>
     <w:p>
@@ -7368,7 +7428,7 @@
         <w:pStyle w:val="ListBullet"/>
       </w:pPr>
       <w:r>
-        <w:t>Turn on chart-design under Visualization.</w:t>
+        <w:t>Name the skill and describe when to use it.</w:t>
       </w:r>
     </w:p>
     <w:p>
@@ -7376,7 +7436,7 @@
         <w:pStyle w:val="ListBullet"/>
       </w:pPr>
       <w:r>
-        <w:t>Call @chart-design for a generic chart.</w:t>
+        <w:t>Write the steps, rules and checks.</w:t>
       </w:r>
     </w:p>
     <w:p>
@@ -7384,7 +7444,7 @@
         <w:pStyle w:val="ListBullet"/>
       </w:pPr>
       <w:r>
-        <w:t>Spot the rules it cannot know.</w:t>
+        <w:t>Add reference files to the folder if needed.</w:t>
       </w:r>
     </w:p>
     <w:p>
@@ -7392,7 +7452,7 @@
         <w:pStyle w:val="ListBullet"/>
       </w:pPr>
       <w:r>
-        <w:t>Write a custom SKILL.md for those rules.</w:t>
+        <w:t>Install it, then call it with @name.</w:t>
       </w:r>
     </w:p>
     <w:p>
@@ -7413,7 +7473,7 @@
         <w:pStyle w:val="ListBullet"/>
       </w:pPr>
       <w:r>
-        <w:t>@chart-design draws a clean overdue-by-category bar chart.</w:t>
+        <w:t>name: water-service-pareto (the same as its folder name).</w:t>
       </w:r>
     </w:p>
     <w:p>
@@ -7421,7 +7481,7 @@
         <w:pStyle w:val="ListBullet"/>
       </w:pPr>
       <w:r>
-        <w:t>It does not know the overdue population or Pareto tie order.</w:t>
+        <w:t>description: Use when I ask for a Pareto chart or failure-mode analysis.</w:t>
       </w:r>
     </w:p>
     <w:p>
@@ -7429,7 +7489,243 @@
         <w:pStyle w:val="ListBullet"/>
       </w:pPr>
       <w:r>
-        <w:t>water-service-pareto adds the cumulative line and named output.</w:t>
+        <w:t>Steps: count, sort high to low, add Cumulative %, list the vital few.</w:t>
+      </w:r>
+    </w:p>
+    <w:p>
+      <w:pPr>
+        <w:keepNext/>
+      </w:pPr>
+      <w:r>
+        <w:rPr>
+          <w:b/>
+          <w:color w:val="1F6FEB"/>
+          <w:sz w:val="22"/>
+        </w:rPr>
+        <w:t>Decision guide</w:t>
+      </w:r>
+    </w:p>
+    <w:tbl>
+      <w:tblPr>
+        <w:tblStyle w:val="TableGrid"/>
+        <w:tblW w:type="auto" w:w="0"/>
+        <w:tblLook w:firstColumn="1" w:firstRow="1" w:lastColumn="0" w:lastRow="0" w:noHBand="0" w:noVBand="1" w:val="04A0"/>
+      </w:tblPr>
+      <w:tblGrid>
+        <w:gridCol w:w="4320"/>
+        <w:gridCol w:w="4320"/>
+      </w:tblGrid>
+      <w:tr>
+        <w:trPr>
+          <w:tblHeader w:val="true"/>
+          <w:cantSplit/>
+        </w:trPr>
+        <w:tc>
+          <w:tcPr>
+            <w:tcW w:type="dxa" w:w="4320"/>
+            <w:shd w:val="clear" w:color="auto" w:fill="E8F0FE"/>
+          </w:tcPr>
+          <w:p>
+            <w:pPr>
+              <w:keepNext/>
+            </w:pPr>
+            <w:r/>
+            <w:r>
+              <w:rPr>
+                <w:b/>
+                <w:sz w:val="19"/>
+              </w:rPr>
+              <w:t>Use when</w:t>
+            </w:r>
+          </w:p>
+        </w:tc>
+        <w:tc>
+          <w:tcPr>
+            <w:tcW w:type="dxa" w:w="4320"/>
+            <w:shd w:val="clear" w:color="auto" w:fill="E8F0FE"/>
+          </w:tcPr>
+          <w:p>
+            <w:pPr>
+              <w:keepNext/>
+            </w:pPr>
+            <w:r/>
+            <w:r>
+              <w:rPr>
+                <w:b/>
+                <w:sz w:val="19"/>
+              </w:rPr>
+              <w:t>Avoid when</w:t>
+            </w:r>
+          </w:p>
+        </w:tc>
+      </w:tr>
+      <w:tr>
+        <w:trPr>
+          <w:cantSplit/>
+        </w:trPr>
+        <w:tc>
+          <w:tcPr>
+            <w:tcW w:type="dxa" w:w="4320"/>
+          </w:tcPr>
+          <w:p>
+            <w:r/>
+            <w:r>
+              <w:rPr>
+                <w:sz w:val="19"/>
+              </w:rPr>
+              <w:t>You repeat the same method in many files.</w:t>
+            </w:r>
+          </w:p>
+        </w:tc>
+        <w:tc>
+          <w:tcPr>
+            <w:tcW w:type="dxa" w:w="4320"/>
+          </w:tcPr>
+          <w:p>
+            <w:r/>
+            <w:r>
+              <w:rPr>
+                <w:sz w:val="19"/>
+              </w:rPr>
+              <w:t>The task is a one-off question a single prompt can answer.</w:t>
+            </w:r>
+          </w:p>
+        </w:tc>
+      </w:tr>
+    </w:tbl>
+    <w:p/>
+    <w:p>
+      <w:pPr>
+        <w:keepNext/>
+      </w:pPr>
+      <w:r>
+        <w:rPr>
+          <w:b/>
+          <w:color w:val="1F6FEB"/>
+          <w:sz w:val="22"/>
+        </w:rPr>
+        <w:t>Authoritative references</w:t>
+      </w:r>
+    </w:p>
+    <w:p>
+      <w:pPr>
+        <w:pStyle w:val="ListBullet"/>
+      </w:pPr>
+      <w:r>
+        <w:t>https://support.microsoft.com/en-us/excel/copilot/copilot-in-excel-skills</w:t>
+      </w:r>
+    </w:p>
+    <w:p>
+      <w:pPr>
+        <w:pStyle w:val="ListBullet"/>
+      </w:pPr>
+      <w:r>
+        <w:t>https://support.microsoft.com/en-us/powerpoint/copilot/copilot-in-powerpoint-skills</w:t>
+      </w:r>
+    </w:p>
+    <w:p/>
+    <w:p>
+      <w:pPr>
+        <w:pStyle w:val="Heading2"/>
+        <w:keepNext/>
+      </w:pPr>
+      <w:r>
+        <w:t>Built-in and Custom Skills</w:t>
+      </w:r>
+    </w:p>
+    <w:p>
+      <w:r>
+        <w:t>Copilot in Excel ships with built-in skills you call with @, such as @chart-design for charts. @chart-design applies the Excel design team’s chart guidance and @theme-design handles workbook formatting. Built-in skills are turned on in Settings (...) &gt; Manage plugins &amp; skills; chart-design sits under Visualization and is off by default. A custom skill is your own SKILL.md for a method Excel does not know, such as the water-service Pareto or dashboard.</w:t>
+      </w:r>
+    </w:p>
+    <w:p>
+      <w:pPr>
+        <w:keepNext/>
+      </w:pPr>
+      <w:r>
+        <w:t>Start with a built-in skill when the task is generic, such as making a clear chart. Write a custom skill when the method carries your own rules: which rows count, how ties sort, which outputs may be replaced and which checks must pass. Both are reusable; only the custom one knows Northstar.</w:t>
+      </w:r>
+    </w:p>
+    <w:p>
+      <w:pPr>
+        <w:keepNext/>
+      </w:pPr>
+      <w:r>
+        <w:rPr>
+          <w:b/>
+          <w:color w:val="1F6FEB"/>
+          <w:sz w:val="22"/>
+        </w:rPr>
+        <w:t>How it works</w:t>
+      </w:r>
+    </w:p>
+    <w:p>
+      <w:pPr>
+        <w:pStyle w:val="ListBullet"/>
+      </w:pPr>
+      <w:r>
+        <w:t>Turn on chart-design under Visualization.</w:t>
+      </w:r>
+    </w:p>
+    <w:p>
+      <w:pPr>
+        <w:pStyle w:val="ListBullet"/>
+      </w:pPr>
+      <w:r>
+        <w:t>Call @chart-design for a generic chart.</w:t>
+      </w:r>
+    </w:p>
+    <w:p>
+      <w:pPr>
+        <w:pStyle w:val="ListBullet"/>
+      </w:pPr>
+      <w:r>
+        <w:t>Spot the rules it cannot know.</w:t>
+      </w:r>
+    </w:p>
+    <w:p>
+      <w:pPr>
+        <w:pStyle w:val="ListBullet"/>
+      </w:pPr>
+      <w:r>
+        <w:t>Write a custom SKILL.md for those rules.</w:t>
+      </w:r>
+    </w:p>
+    <w:p>
+      <w:pPr>
+        <w:keepNext/>
+      </w:pPr>
+      <w:r>
+        <w:rPr>
+          <w:b/>
+          <w:color w:val="1F6FEB"/>
+          <w:sz w:val="22"/>
+        </w:rPr>
+        <w:t>Worked example</w:t>
+      </w:r>
+    </w:p>
+    <w:p>
+      <w:pPr>
+        <w:pStyle w:val="ListBullet"/>
+      </w:pPr>
+      <w:r>
+        <w:t>@chart-design draws a clean bar chart of work orders by failure mode.</w:t>
+      </w:r>
+    </w:p>
+    <w:p>
+      <w:pPr>
+        <w:pStyle w:val="ListBullet"/>
+      </w:pPr>
+      <w:r>
+        <w:t>It does not add the cumulative line or the vital-few list.</w:t>
+      </w:r>
+    </w:p>
+    <w:p>
+      <w:pPr>
+        <w:pStyle w:val="ListBullet"/>
+      </w:pPr>
+      <w:r>
+        <w:t>water-service-pareto adds both, the same way every time.</w:t>
       </w:r>
     </w:p>
     <w:p>
@@ -7570,20 +7866,20 @@
         <w:keepNext/>
       </w:pPr>
       <w:r>
-        <w:t>Pareto Skill: Counts, Sorting and Cumulative Share</w:t>
-      </w:r>
-    </w:p>
-    <w:p>
-      <w:r>
-        <w:t>A Pareto contribution chart orders category counts from largest to smallest and adds a cumulative-percentage line. The population here is overdue backlog, not all work orders: nonterminal statuses with Due_Date strictly before the reporting date. Alphabetical tie sorting keeps equal counts in a repeatable order.</w:t>
-      </w:r>
-    </w:p>
-    <w:p>
-      <w:pPr>
-        <w:keepNext/>
-      </w:pPr>
-      <w:r>
-        <w:t>The Skill turns a recurring grouping-and-charting method into reusable instructions. Counts and cumulative formulas must reconcile to the same eligible source rows. A right-hand percentage axis from zero to 100% prevents interpreting the line as another count series. Category concentration describes contribution rather than establishing root cause.</w:t>
+        <w:t>Pareto Skill: Find the Vital Few Failure Modes</w:t>
+      </w:r>
+    </w:p>
+    <w:p>
+      <w:r>
+        <w:t>A Pareto chart sorts categories from highest to lowest count and adds a cumulative-percentage line. Engineers use it to find the vital few failure modes or root-cause categories that account for most of the work, so improvement effort goes where it matters most. Here each Northstar work order records its Failure_Mode.</w:t>
+      </w:r>
+    </w:p>
+    <w:p>
+      <w:pPr>
+        <w:keepNext/>
+      </w:pPr>
+      <w:r>
+        <w:t>The water-service-pareto Skill turns the method into reusable instructions: count, sort high to low, add Share % and Cumulative %, chart it and list the categories needed to reach 80%. Counts must reconcile to the source rows. A Pareto shows where work concentrates; the engineer still confirms the root cause on site before acting.</w:t>
       </w:r>
     </w:p>
     <w:p>
@@ -7604,7 +7900,7 @@
         <w:pStyle w:val="ListBullet"/>
       </w:pPr>
       <w:r>
-        <w:t>Define source, population, date and grouping.</w:t>
+        <w:t>Choose the table and the column to analyse.</w:t>
       </w:r>
     </w:p>
     <w:p>
@@ -7612,7 +7908,7 @@
         <w:pStyle w:val="ListBullet"/>
       </w:pPr>
       <w:r>
-        <w:t>Count and sort with stable ties.</w:t>
+        <w:t>Count and sort from highest to lowest.</w:t>
       </w:r>
     </w:p>
     <w:p>
@@ -7620,7 +7916,7 @@
         <w:pStyle w:val="ListBullet"/>
       </w:pPr>
       <w:r>
-        <w:t>Calculate cumulative count / eligible total.</w:t>
+        <w:t>Add Share % and Cumulative %.</w:t>
       </w:r>
     </w:p>
     <w:p>
@@ -7628,7 +7924,7 @@
         <w:pStyle w:val="ListBullet"/>
       </w:pPr>
       <w:r>
-        <w:t>Build and verify an editable dual-axis chart.</w:t>
+        <w:t>List the vital few that reach 80%.</w:t>
       </w:r>
     </w:p>
     <w:p>
@@ -7649,7 +7945,7 @@
         <w:pStyle w:val="ListBullet"/>
       </w:pPr>
       <w:r>
-        <w:t>Pump 18; Meter 12; Leak 8; Valve 8; Pipe 4: total 50.</w:t>
+        <w:t>All 120 work orders: Corrosion 42, Joint seal leak 30, Valve seat wear 22.</w:t>
       </w:r>
     </w:p>
     <w:p>
@@ -7657,7 +7953,7 @@
         <w:pStyle w:val="ListBullet"/>
       </w:pPr>
       <w:r>
-        <w:t>Cumulative percentages are 36%, 60%, 76%, 92%, 100%.</w:t>
+        <w:t>These 3 of 8 failure modes cause 78% of the work.</w:t>
       </w:r>
     </w:p>
     <w:p>
@@ -7665,7 +7961,7 @@
         <w:pStyle w:val="ListBullet"/>
       </w:pPr>
       <w:r>
-        <w:t>Four of five categories first reach 80%; do not force an 80/20 conclusion.</w:t>
+        <w:t>Overdue jobs only: Joint seal leak moves to the top (14 of 50).</w:t>
       </w:r>
     </w:p>
     <w:p>
@@ -7749,7 +8045,7 @@
               <w:rPr>
                 <w:sz w:val="19"/>
               </w:rPr>
-              <w:t>The count population and grouping are defined and auditable.</w:t>
+              <w:t>You need to decide which failure modes to tackle first.</w:t>
             </w:r>
           </w:p>
         </w:tc>
@@ -7763,7 +8059,7 @@
               <w:rPr>
                 <w:sz w:val="19"/>
               </w:rPr>
-              <w:t>Categories are being called causes or zero-total shares treated as measured 0%.</w:t>
+              <w:t>A count is treated as a proven cause without checking on site.</w:t>
             </w:r>
           </w:p>
         </w:tc>
@@ -7798,7 +8094,7 @@
         <w:keepNext/>
       </w:pPr>
       <w:r>
-        <w:t>Lab 5 · Custom Pareto Chart Skill — Use the Built-in Chart Skill, then Create a Custom Pareto Skill</w:t>
+        <w:t>Lab 5 · Custom Pareto Chart Skill — Find the Vital Few Failure Modes with a Pareto Skill</w:t>
       </w:r>
     </w:p>
     <w:p>
@@ -7811,15 +8107,15 @@
     </w:p>
     <w:p>
       <w:r>
-        <w:t>Goal: Make a chart with Excel’s built-in @chart-design skill, then install a custom Pareto skill and use it twice.</w:t>
-      </w:r>
-    </w:p>
-    <w:p>
-      <w:pPr>
-        <w:keepNext/>
-      </w:pPr>
-      <w:r>
-        <w:t>Make a chart with Excel’s built-in @chart-design skill, then install a custom Pareto skill and use it twice.</w:t>
+        <w:t>Goal: Engineers use Pareto charts to find the vital few failure modes behind most of the work. Make a chart with Excel’s built-in @chart-design skill, then install a custom Pareto skill that sorts failure modes from highest to lowest.</w:t>
+      </w:r>
+    </w:p>
+    <w:p>
+      <w:pPr>
+        <w:keepNext/>
+      </w:pPr>
+      <w:r>
+        <w:t>Engineers use Pareto charts to find the vital few failure modes behind most of the work. Make a chart with Excel’s built-in @chart-design skill, then install a custom Pareto skill that sorts failure modes from highest to lowest.</w:t>
       </w:r>
     </w:p>
     <w:p>
@@ -7840,7 +8136,7 @@
         <w:keepNext/>
       </w:pPr>
       <w:r>
-        <w:t>A ChartDesign_Demo sheet, a Pareto_Job_Category chart and a Pareto_Site chart.   (Tools: Excel Copilot · Microsoft 365 Copilot web · OneDrive (Skills folder only).)</w:t>
+        <w:t>A ChartDesign_Demo sheet, a Pareto_Failure_Mode chart for all work orders and one for the overdue jobs.   (Tools: Excel Copilot · Microsoft 365 Copilot web · OneDrive (Skills folder only).)</w:t>
       </w:r>
     </w:p>
     <w:p>
@@ -7939,7 +8235,7 @@
         <w:t xml:space="preserve">2.  </w:t>
       </w:r>
       <w:r>
-        <w:t>Use it. Choose Allow editing and send the prompt. Select Done to keep the change, or Undo to reverse it.</w:t>
+        <w:t>Use it. Choose Allow editing and send the prompt. Select Done to keep the change, or Undo to reverse it. The bars run from highest to lowest, starting with Corrosion.</w:t>
       </w:r>
     </w:p>
     <w:p>
@@ -7966,7 +8262,7 @@
           <w:color w:val="0B3060"/>
           <w:sz w:val="19"/>
         </w:rPr>
-        <w:t>@chart-design Make a bar chart of the overdue work orders by Job_Category on a new sheet named ChartDesign_Demo, biggest bar first. Overdue means not Closed or Cancelled and due before the date in Control!B2.</w:t>
+        <w:t>@chart-design Make a bar chart of the number of work orders for each Failure_Mode on a new sheet named ChartDesign_Demo, sorted from highest to lowest.</w:t>
       </w:r>
     </w:p>
     <w:p>
@@ -8009,7 +8305,7 @@
         <w:t xml:space="preserve">4.  </w:t>
       </w:r>
       <w:r>
-        <w:t>Turn the skill on. Back in Excel select Settings (...) &gt; Manage plugins &amp; skills &gt; Custom skills &gt; Refresh, then turn water-service-pareto on. Close the dialog and type @wat in the Copilot prompt box: water-service-pareto should appear. If it does not, wait a minute and select Refresh again.</w:t>
+        <w:t>Turn the skill on. Back in Excel select Settings (...) &gt; Manage plugins &amp; skills &gt; Custom skills &gt; Refresh, then turn water-service-pareto on. Close the dialog and type @wat in the Copilot prompt box: water-service-pareto should appear. If not, wait a minute and select Refresh again.</w:t>
       </w:r>
     </w:p>
     <w:p>
@@ -8022,7 +8318,7 @@
           <w:color w:val="0B3060"/>
           <w:sz w:val="19"/>
         </w:rPr>
-        <w:t>Check : water-service-pareto appears when you type @wat</w:t>
+        <w:t>Check : water-service-pareto appears when you type @</w:t>
       </w:r>
     </w:p>
     <w:p>
@@ -8037,7 +8333,7 @@
         <w:t xml:space="preserve">5.  </w:t>
       </w:r>
       <w:r>
-        <w:t>Make the Pareto chart. Select New chat, choose Allow editing, send the prompt and select Done. You should see 50 overdue jobs: Pump Service 18, Meter Service 12, Leak Repair 8, Valve Repair 8, Pipe Replacement 4, and a line rising 36%, 60%, 76%, 92%, 100%.</w:t>
+        <w:t>Find the vital few. Select New chat, choose Allow editing, send the prompt and select Done. You should see Corrosion 42, Joint seal leak 30, Valve seat wear 22, Pump bearing wear 10, Pressure surge 8, Meter fault 4, Blockage 2, Third-party damage 2. The top 3 failure modes cause 78% of all work orders.</w:t>
       </w:r>
     </w:p>
     <w:p>
@@ -8064,7 +8360,7 @@
           <w:color w:val="0B3060"/>
           <w:sz w:val="19"/>
         </w:rPr>
-        <w:t>@water-service-pareto Make a Pareto chart of the overdue work orders by Job_Category.</w:t>
+        <w:t>@water-service-pareto Make a Pareto chart of Failure_Mode for all work orders in tblWorkOrders.</w:t>
       </w:r>
     </w:p>
     <w:p>
@@ -8079,7 +8375,7 @@
         <w:t xml:space="preserve">6.  </w:t>
       </w:r>
       <w:r>
-        <w:t>Use the skill again. Send the prompt and select Done. Pareto_Site also adds up to 50.</w:t>
+        <w:t>Look at the overdue jobs. Send the prompt and select Done. Among the 50 overdue jobs the order changes: Joint seal leak 14, Corrosion 13, Valve seat wear 8, Pump bearing wear 7, Pressure surge 3, Blockage 2, Meter fault 2, Third-party damage 1. A Pareto shows where to look first; confirm the root cause on site.</w:t>
       </w:r>
     </w:p>
     <w:p>
@@ -8106,7 +8402,7 @@
           <w:color w:val="0B3060"/>
           <w:sz w:val="19"/>
         </w:rPr>
-        <w:t>@water-service-pareto Now make the same Pareto chart by Site.</w:t>
+        <w:t>@water-service-pareto Now make the same Pareto chart for the overdue work orders only.</w:t>
       </w:r>
     </w:p>
     <w:p>
@@ -8210,7 +8506,7 @@
               <w:rPr>
                 <w:sz w:val="19"/>
               </w:rPr>
-              <w:t>chart-design turned on; ChartDesign_Demo created.</w:t>
+              <w:t>chart-design turned on; ChartDesign_Demo sorted highest to lowest.</w:t>
             </w:r>
           </w:p>
         </w:tc>
@@ -8232,7 +8528,7 @@
               <w:rPr>
                 <w:sz w:val="19"/>
               </w:rPr>
-              <w:t>Pareto by category</w:t>
+              <w:t>All work orders</w:t>
             </w:r>
           </w:p>
         </w:tc>
@@ -8249,7 +8545,7 @@
               <w:rPr>
                 <w:sz w:val="19"/>
               </w:rPr>
-              <w:t>50 jobs: 18, 12, 8, 8, 4; line 36%, 60%, 76%, 92%, 100%.</w:t>
+              <w:t>Corrosion 42, Joint seal leak 30, Valve seat wear 22, Pump bearing wear 10, Pressure surge 8, Meter fault 4, Blockage 2, Third-party damage 2; top 3 = 78%.</w:t>
             </w:r>
           </w:p>
         </w:tc>
@@ -8268,7 +8564,7 @@
               <w:rPr>
                 <w:sz w:val="19"/>
               </w:rPr>
-              <w:t>Pareto by site</w:t>
+              <w:t>Overdue only</w:t>
             </w:r>
           </w:p>
         </w:tc>
@@ -8282,7 +8578,7 @@
               <w:rPr>
                 <w:sz w:val="19"/>
               </w:rPr>
-              <w:t>Pareto_Site also adds up to 50; the source data is unchanged.</w:t>
+              <w:t>Joint seal leak 14, Corrosion 13, Valve seat wear 8, Pump bearing wear 7, Pressure surge 3, Blockage 2, Meter fault 2, Third-party damage 1.</w:t>
             </w:r>
           </w:p>
         </w:tc>
@@ -9479,7 +9775,7 @@
         <w:keepNext/>
       </w:pPr>
       <w:r>
-        <w:t>Lab 6 · Reporting Skill — Create, Use and Improve the Maintenance Reporting Skill</w:t>
+        <w:t>Lab 6 · Reporting Skill — Build a Maintenance Report with Two Skills</w:t>
       </w:r>
     </w:p>
     <w:p>
@@ -9492,15 +9788,15 @@
     </w:p>
     <w:p>
       <w:r>
-        <w:t>Goal: Install the maintenance-reporting skill and use it in Excel and PowerPoint.</w:t>
-      </w:r>
-    </w:p>
-    <w:p>
-      <w:pPr>
-        <w:keepNext/>
-      </w:pPr>
-      <w:r>
-        <w:t>Install the maintenance-reporting skill and use it in Excel and PowerPoint.</w:t>
+        <w:t>Goal: Install two skills, water-service-pareto and maintenance-reporting, and use them together to build a maintenance report in Excel, then use the reporting skill in PowerPoint.</w:t>
+      </w:r>
+    </w:p>
+    <w:p>
+      <w:pPr>
+        <w:keepNext/>
+      </w:pPr>
+      <w:r>
+        <w:t>Install two skills, water-service-pareto and maintenance-reporting, and use them together to build a maintenance report in Excel, then use the reporting skill in PowerPoint.</w:t>
       </w:r>
     </w:p>
     <w:p>
@@ -9521,7 +9817,7 @@
         <w:keepNext/>
       </w:pPr>
       <w:r>
-        <w:t>Maintenance_Summary and Assignment_Proposals sheets, and an improved Northstar_Initial_Update.pptx.   (Tools: Excel and PowerPoint Copilot · Microsoft 365 Copilot web · OneDrive (Skills folder only).)</w:t>
+        <w:t>Maintenance_Summary with a failure-mode Pareto, Assignment_Proposals, and an improved Northstar_Initial_Update.pptx.   (Tools: Excel and PowerPoint Copilot · Microsoft 365 Copilot web · OneDrive (Skills folder only).)</w:t>
       </w:r>
     </w:p>
     <w:p>
@@ -9578,11 +9874,12 @@
         <w:t xml:space="preserve">1.  </w:t>
       </w:r>
       <w:r>
-        <w:t>Upload the skill to OneDrive. In Excel open Copilot and select Settings (...) &gt; Manage plugins &amp; skills &gt; Custom skills. Turn Custom skills on and select Add in OneDrive (or Create OneDrive folder, then Open skills folder). OneDrive opens at your skills folder. Select Create or upload &gt; Folder upload and choose the maintenance-reporting folder in this lab’s data/templates folder.</w:t>
-      </w:r>
-    </w:p>
-    <w:p>
-      <w:pPr>
+        <w:t>Upload the skill to OneDrive. In Excel open Copilot and select Settings (...) &gt; Manage plugins &amp; skills &gt; Custom skills. Turn Custom skills on and select Add in OneDrive (or Create OneDrive folder, then Open skills folder). OneDrive opens at your skills folder. Select Create or upload &gt; Folder upload and choose the water-service-pareto and maintenance-reporting folders in this lab’s data/templates folder.</w:t>
+      </w:r>
+    </w:p>
+    <w:p>
+      <w:pPr>
+        <w:keepNext/>
         <w:keepLines/>
       </w:pPr>
       <w:r>
@@ -9591,22 +9888,7 @@
           <w:color w:val="0B3060"/>
           <w:sz w:val="19"/>
         </w:rPr>
-        <w:t>OneDrive : Documents &gt; Copilot &gt; Microsoft Excel &gt; skills &gt; maintenance-reporting &gt; SKILL.md</w:t>
-      </w:r>
-    </w:p>
-    <w:p>
-      <w:pPr>
-        <w:spacing w:after="80"/>
-        <w:ind w:left="360"/>
-      </w:pPr>
-      <w:r>
-        <w:rPr>
-          <w:b/>
-        </w:rPr>
-        <w:t xml:space="preserve">2.  </w:t>
-      </w:r>
-      <w:r>
-        <w:t>Turn the skill on. Back in Excel select Settings (...) &gt; Manage plugins &amp; skills &gt; Custom skills &gt; Refresh, then turn maintenance-reporting on. Close the dialog and type @main in the Copilot prompt box: maintenance-reporting should appear. If it does not, wait a minute and select Refresh again.</w:t>
+        <w:t>OneDrive : Documents &gt; Copilot &gt; Microsoft Excel &gt; skills &gt; water-service-pareto &gt; SKILL.md</w:t>
       </w:r>
     </w:p>
     <w:p>
@@ -9619,7 +9901,7 @@
           <w:color w:val="0B3060"/>
           <w:sz w:val="19"/>
         </w:rPr>
-        <w:t>Check : maintenance-reporting appears when you type @main</w:t>
+        <w:t>OneDrive : Documents &gt; Copilot &gt; Microsoft Excel &gt; skills &gt; maintenance-reporting &gt; SKILL.md</w:t>
       </w:r>
     </w:p>
     <w:p>
@@ -9631,10 +9913,10 @@
         <w:rPr>
           <w:b/>
         </w:rPr>
-        <w:t xml:space="preserve">3.  </w:t>
-      </w:r>
-      <w:r>
-        <w:t>Build the summary. Open data/Northstar_Work_Orders.xlsx, select New chat, choose Allow editing and send the prompt. Select Done to keep the change, or Undo to reverse it. You should see 120 total, 48 closed, 12 cancelled, 60 backlog, 50 overdue, on-time 30/48 = 62.5% and cost S$35,827.50.</w:t>
+        <w:t xml:space="preserve">2.  </w:t>
+      </w:r>
+      <w:r>
+        <w:t>Turn the skills on. Back in Excel select Settings (...) &gt; Manage plugins &amp; skills &gt; Custom skills &gt; Refresh, then turn water-service-pareto and maintenance-reporting on. Close the dialog and type @ in the Copilot prompt box: water-service-pareto and maintenance-reporting should appear. If not, wait a minute and select Refresh again.</w:t>
       </w:r>
     </w:p>
     <w:p>
@@ -9648,7 +9930,7 @@
           <w:color w:val="0B3060"/>
           <w:sz w:val="19"/>
         </w:rPr>
-        <w:t>EXCEL - ALLOW EDITING:</w:t>
+        <w:t>Check : water-service-pareto appears when you type @</w:t>
       </w:r>
     </w:p>
     <w:p>
@@ -9661,7 +9943,7 @@
           <w:color w:val="0B3060"/>
           <w:sz w:val="19"/>
         </w:rPr>
-        <w:t>@maintenance-reporting Build a Maintenance_Summary sheet for 30 September 2026 with the total, closed, cancelled, backlog, overdue, on-time closure rate and cost.</w:t>
+        <w:t>Check : maintenance-reporting appears when you type @</w:t>
       </w:r>
     </w:p>
     <w:p>
@@ -9673,10 +9955,10 @@
         <w:rPr>
           <w:b/>
         </w:rPr>
-        <w:t xml:space="preserve">4.  </w:t>
-      </w:r>
-      <w:r>
-        <w:t>Suggest owners. Send the prompt and select Done. Assignment_Proposals lists 6 jobs, each marked as a proposal, and Assigned_To on Work_Orders is unchanged. Save the workbook.</w:t>
+        <w:t xml:space="preserve">3.  </w:t>
+      </w:r>
+      <w:r>
+        <w:t>Build the summary. Open data/Northstar_Work_Orders.xlsx, select New chat, choose Allow editing and send the prompt. Select Done to keep the change, or Undo to reverse it. You should see 120 total, 48 closed, 12 cancelled, 60 backlog, 50 overdue, on-time 30/48 = 62.5% and cost S$35,827.50.</w:t>
       </w:r>
     </w:p>
     <w:p>
@@ -9703,7 +9985,7 @@
           <w:color w:val="0B3060"/>
           <w:sz w:val="19"/>
         </w:rPr>
-        <w:t>@maintenance-reporting Add an Assignment_Proposals sheet for the backlog jobs with no owner. Suggest an owner from tblTechnicians with the same job category and free hours, and mark each one as a proposal. Don’t change Assigned_To.</w:t>
+        <w:t>@maintenance-reporting Build a Maintenance_Summary sheet for 30 September 2026 with the total, closed, cancelled, backlog, overdue, on-time closure rate and cost.</w:t>
       </w:r>
     </w:p>
     <w:p>
@@ -9715,10 +9997,10 @@
         <w:rPr>
           <w:b/>
         </w:rPr>
-        <w:t xml:space="preserve">5.  </w:t>
-      </w:r>
-      <w:r>
-        <w:t>Test it with no data. Open a new blank workbook, send the prompt and read the reply: a good skill asks you for the data instead of making up numbers. Close the blank workbook without saving.</w:t>
+        <w:t xml:space="preserve">4.  </w:t>
+      </w:r>
+      <w:r>
+        <w:t>Add the failure-mode Pareto. Send the prompt and select Done. The chart is sorted from highest to lowest: Corrosion 42, Joint seal leak 30, Valve seat wear 22, Pump bearing wear 10, Pressure surge 8, Meter fault 4, Blockage 2, Third-party damage 2.</w:t>
       </w:r>
     </w:p>
     <w:p>
@@ -9732,7 +10014,7 @@
           <w:color w:val="0B3060"/>
           <w:sz w:val="19"/>
         </w:rPr>
-        <w:t>EXCEL - CHAT ONLY:</w:t>
+        <w:t>EXCEL - ALLOW EDITING:</w:t>
       </w:r>
     </w:p>
     <w:p>
@@ -9745,7 +10027,49 @@
           <w:color w:val="0B3060"/>
           <w:sz w:val="19"/>
         </w:rPr>
-        <w:t>@maintenance-reporting Prepare my maintenance report for last month.</w:t>
+        <w:t>@water-service-pareto Make a Pareto chart of Failure_Mode for all work orders and place it on the Maintenance_Summary sheet, to the right of the numbers.</w:t>
+      </w:r>
+    </w:p>
+    <w:p>
+      <w:pPr>
+        <w:spacing w:after="80"/>
+        <w:ind w:left="360"/>
+      </w:pPr>
+      <w:r>
+        <w:rPr>
+          <w:b/>
+        </w:rPr>
+        <w:t xml:space="preserve">5.  </w:t>
+      </w:r>
+      <w:r>
+        <w:t>Suggest owners. Send the prompt and select Done. Assignment_Proposals lists 6 jobs, each marked as a proposal, and Assigned_To on Work_Orders is unchanged. Save the workbook.</w:t>
+      </w:r>
+    </w:p>
+    <w:p>
+      <w:pPr>
+        <w:keepNext/>
+        <w:keepLines/>
+      </w:pPr>
+      <w:r>
+        <w:rPr>
+          <w:rFonts w:ascii="Consolas" w:hAnsi="Consolas"/>
+          <w:color w:val="0B3060"/>
+          <w:sz w:val="19"/>
+        </w:rPr>
+        <w:t>EXCEL - ALLOW EDITING:</w:t>
+      </w:r>
+    </w:p>
+    <w:p>
+      <w:pPr>
+        <w:keepLines/>
+      </w:pPr>
+      <w:r>
+        <w:rPr>
+          <w:rFonts w:ascii="Consolas" w:hAnsi="Consolas"/>
+          <w:color w:val="0B3060"/>
+          <w:sz w:val="19"/>
+        </w:rPr>
+        <w:t>@maintenance-reporting Add an Assignment_Proposals sheet for the backlog jobs with no owner. Suggest an owner from tblTechnicians with the same job category and free hours, and mark each one as a proposal. Don’t change Assigned_To.</w:t>
       </w:r>
     </w:p>
     <w:p>
@@ -9913,7 +10237,7 @@
               <w:rPr>
                 <w:sz w:val="19"/>
               </w:rPr>
-              <w:t>Proposals</w:t>
+              <w:t>Pareto</w:t>
             </w:r>
           </w:p>
         </w:tc>
@@ -9930,7 +10254,7 @@
               <w:rPr>
                 <w:sz w:val="19"/>
               </w:rPr>
-              <w:t>6 proposals; Assigned_To unchanged.</w:t>
+              <w:t>Corrosion 42, Joint seal leak 30, Valve seat wear 22, Pump bearing wear 10, Pressure surge 8, Meter fault 4, Blockage 2, Third-party damage 2.</w:t>
             </w:r>
           </w:p>
         </w:tc>
@@ -9952,7 +10276,7 @@
               <w:rPr>
                 <w:sz w:val="19"/>
               </w:rPr>
-              <w:t>No data</w:t>
+              <w:t>Proposals</w:t>
             </w:r>
           </w:p>
         </w:tc>
@@ -9969,7 +10293,7 @@
               <w:rPr>
                 <w:sz w:val="19"/>
               </w:rPr>
-              <w:t>The skill asks for data instead of making up numbers.</w:t>
+              <w:t>6 proposals; Assigned_To unchanged.</w:t>
             </w:r>
           </w:p>
         </w:tc>
@@ -10207,7 +10531,7 @@
         <w:keepNext/>
       </w:pPr>
       <w:r>
-        <w:t>Improve SKILL.md to v2 (for example a clearer rule for missing data), upload it again and repeat the no-data test.</w:t>
+        <w:t>Open a new blank workbook and ask @maintenance-reporting for last month’s report: a good skill asks for the data instead of inventing numbers.</w:t>
       </w:r>
     </w:p>
     <w:p>
@@ -10241,6 +10565,943 @@
           <w:sz w:val="20"/>
         </w:rPr>
         <w:t>The lab folder labs/lab-06-*/ holds the instruction PDF with sample prompts, a data folder with the lab workbook and any templates (data/Northstar_Work_Orders.xlsx), plus data/templates/maintenance-reporting/SKILL.md (Reviewed reporting Skill fallback). Northstar Water Services is a fictional water-pipe maintenance and service company. All service hubs, staff and work orders are synthetic. Use the fixed reporting date 2026-09-30; missing facts remain UNKNOWN. Proposals do not change real assignments. Training email drafts are never sent.</w:t>
+      </w:r>
+    </w:p>
+    <w:p/>
+    <w:p>
+      <w:r>
+        <w:t>Concepts for Lab 7: PowerPoint Design Skill: From Plain to Professional.</w:t>
+      </w:r>
+    </w:p>
+    <w:p>
+      <w:pPr>
+        <w:pStyle w:val="Heading2"/>
+        <w:keepNext/>
+      </w:pPr>
+      <w:r>
+        <w:t>PowerPoint Design Skill: From Plain to Professional</w:t>
+      </w:r>
+    </w:p>
+    <w:p>
+      <w:r>
+        <w:t>A design skill holds your brand rules, fonts, colours, header bar, footer, KPI cards and spacing, as steps Copilot in PowerPoint follows. Called on a plain deck, it redesigns every slide the same way while keeping every slide, number and fact.</w:t>
+      </w:r>
+    </w:p>
+    <w:p>
+      <w:pPr>
+        <w:keepNext/>
+      </w:pPr>
+      <w:r>
+        <w:t>Most decks start plain: black text, no header, no branding. Restyling slide by slide is slow and inconsistent. A design skill makes a professional look one prompt away and the same for every deck the team produces.</w:t>
+      </w:r>
+    </w:p>
+    <w:p>
+      <w:pPr>
+        <w:keepNext/>
+      </w:pPr>
+      <w:r>
+        <w:rPr>
+          <w:b/>
+          <w:color w:val="1F6FEB"/>
+          <w:sz w:val="22"/>
+        </w:rPr>
+        <w:t>How it works</w:t>
+      </w:r>
+    </w:p>
+    <w:p>
+      <w:pPr>
+        <w:pStyle w:val="ListBullet"/>
+      </w:pPr>
+      <w:r>
+        <w:t>Write the brand rules as a SKILL.md.</w:t>
+      </w:r>
+    </w:p>
+    <w:p>
+      <w:pPr>
+        <w:pStyle w:val="ListBullet"/>
+      </w:pPr>
+      <w:r>
+        <w:t>Add it with + &gt; Choose skills &gt; Manage skills &gt; Add skill.</w:t>
+      </w:r>
+    </w:p>
+    <w:p>
+      <w:pPr>
+        <w:pStyle w:val="ListBullet"/>
+      </w:pPr>
+      <w:r>
+        <w:t>Call it on a plain deck.</w:t>
+      </w:r>
+    </w:p>
+    <w:p>
+      <w:pPr>
+        <w:pStyle w:val="ListBullet"/>
+      </w:pPr>
+      <w:r>
+        <w:t>Check every number is unchanged.</w:t>
+      </w:r>
+    </w:p>
+    <w:p>
+      <w:pPr>
+        <w:keepNext/>
+      </w:pPr>
+      <w:r>
+        <w:rPr>
+          <w:b/>
+          <w:color w:val="1F6FEB"/>
+          <w:sz w:val="22"/>
+        </w:rPr>
+        <w:t>Worked example</w:t>
+      </w:r>
+    </w:p>
+    <w:p>
+      <w:pPr>
+        <w:pStyle w:val="ListBullet"/>
+      </w:pPr>
+      <w:r>
+        <w:t>Title slide: navy background, white title, teal subtitle.</w:t>
+      </w:r>
+    </w:p>
+    <w:p>
+      <w:pPr>
+        <w:pStyle w:val="ListBullet"/>
+      </w:pPr>
+      <w:r>
+        <w:t>Content slides: navy header bar, KPI cards, footer with slide number.</w:t>
+      </w:r>
+    </w:p>
+    <w:p>
+      <w:pPr>
+        <w:pStyle w:val="ListBullet"/>
+      </w:pPr>
+      <w:r>
+        <w:t>Numbers such as 120 work orders and 50 overdue stay the same.</w:t>
+      </w:r>
+    </w:p>
+    <w:p>
+      <w:pPr>
+        <w:keepNext/>
+      </w:pPr>
+      <w:r>
+        <w:rPr>
+          <w:b/>
+          <w:color w:val="1F6FEB"/>
+          <w:sz w:val="22"/>
+        </w:rPr>
+        <w:t>Decision guide</w:t>
+      </w:r>
+    </w:p>
+    <w:tbl>
+      <w:tblPr>
+        <w:tblStyle w:val="TableGrid"/>
+        <w:tblW w:type="auto" w:w="0"/>
+        <w:tblLook w:firstColumn="1" w:firstRow="1" w:lastColumn="0" w:lastRow="0" w:noHBand="0" w:noVBand="1" w:val="04A0"/>
+      </w:tblPr>
+      <w:tblGrid>
+        <w:gridCol w:w="4320"/>
+        <w:gridCol w:w="4320"/>
+      </w:tblGrid>
+      <w:tr>
+        <w:trPr>
+          <w:tblHeader w:val="true"/>
+          <w:cantSplit/>
+        </w:trPr>
+        <w:tc>
+          <w:tcPr>
+            <w:tcW w:type="dxa" w:w="4320"/>
+            <w:shd w:val="clear" w:color="auto" w:fill="E8F0FE"/>
+          </w:tcPr>
+          <w:p>
+            <w:pPr>
+              <w:keepNext/>
+            </w:pPr>
+            <w:r/>
+            <w:r>
+              <w:rPr>
+                <w:b/>
+                <w:sz w:val="19"/>
+              </w:rPr>
+              <w:t>Use when</w:t>
+            </w:r>
+          </w:p>
+        </w:tc>
+        <w:tc>
+          <w:tcPr>
+            <w:tcW w:type="dxa" w:w="4320"/>
+            <w:shd w:val="clear" w:color="auto" w:fill="E8F0FE"/>
+          </w:tcPr>
+          <w:p>
+            <w:pPr>
+              <w:keepNext/>
+            </w:pPr>
+            <w:r/>
+            <w:r>
+              <w:rPr>
+                <w:b/>
+                <w:sz w:val="19"/>
+              </w:rPr>
+              <w:t>Avoid when</w:t>
+            </w:r>
+          </w:p>
+        </w:tc>
+      </w:tr>
+      <w:tr>
+        <w:trPr>
+          <w:cantSplit/>
+        </w:trPr>
+        <w:tc>
+          <w:tcPr>
+            <w:tcW w:type="dxa" w:w="4320"/>
+          </w:tcPr>
+          <w:p>
+            <w:r/>
+            <w:r>
+              <w:rPr>
+                <w:sz w:val="19"/>
+              </w:rPr>
+              <w:t>Many decks need the same professional look.</w:t>
+            </w:r>
+          </w:p>
+        </w:tc>
+        <w:tc>
+          <w:tcPr>
+            <w:tcW w:type="dxa" w:w="4320"/>
+          </w:tcPr>
+          <w:p>
+            <w:r/>
+            <w:r>
+              <w:rPr>
+                <w:sz w:val="19"/>
+              </w:rPr>
+              <w:t>The skill is allowed to change numbers or add facts.</w:t>
+            </w:r>
+          </w:p>
+        </w:tc>
+      </w:tr>
+    </w:tbl>
+    <w:p/>
+    <w:p>
+      <w:pPr>
+        <w:keepNext/>
+      </w:pPr>
+      <w:r>
+        <w:rPr>
+          <w:b/>
+          <w:color w:val="1F6FEB"/>
+          <w:sz w:val="22"/>
+        </w:rPr>
+        <w:t>Authoritative references</w:t>
+      </w:r>
+    </w:p>
+    <w:p>
+      <w:pPr>
+        <w:pStyle w:val="ListBullet"/>
+      </w:pPr>
+      <w:r>
+        <w:t>https://support.microsoft.com/en-us/powerpoint/copilot/copilot-in-powerpoint-skills</w:t>
+      </w:r>
+    </w:p>
+    <w:p/>
+    <w:p>
+      <w:pPr>
+        <w:pStyle w:val="Heading2"/>
+        <w:keepNext/>
+      </w:pPr>
+      <w:r>
+        <w:t>Lab 7 · PowerPoint Design Skill — Create a PowerPoint Design Skill: From Plain to Professional</w:t>
+      </w:r>
+    </w:p>
+    <w:p>
+      <w:pPr>
+        <w:keepNext/>
+      </w:pPr>
+      <w:r>
+        <w:t>Learning outcome: LO2: create and improve a reusable maintenance skill in Excel and PowerPoint.</w:t>
+      </w:r>
+    </w:p>
+    <w:p>
+      <w:r>
+        <w:t>Goal: Northstar_Professional_Update.pptx, redesigned by your own northstar-deck-design skill.</w:t>
+      </w:r>
+    </w:p>
+    <w:p>
+      <w:pPr>
+        <w:keepNext/>
+      </w:pPr>
+      <w:r>
+        <w:t>Turn a plain, unbranded PowerPoint deck into a professional Northstar deck by creating a design skill once and calling it with @.</w:t>
+      </w:r>
+    </w:p>
+    <w:p>
+      <w:pPr>
+        <w:keepNext/>
+      </w:pPr>
+      <w:r>
+        <w:rPr>
+          <w:b/>
+          <w:color w:val="1F6FEB"/>
+          <w:sz w:val="22"/>
+        </w:rPr>
+        <w:t>What you'll build</w:t>
+      </w:r>
+    </w:p>
+    <w:p>
+      <w:pPr>
+        <w:keepNext/>
+      </w:pPr>
+      <w:r>
+        <w:t>Northstar_Professional_Update.pptx, redesigned by your own northstar-deck-design skill.   (Tools: Microsoft 365 Copilot · PowerPoint · Microsoft 365 Copilot web.)</w:t>
+      </w:r>
+    </w:p>
+    <w:p>
+      <w:pPr>
+        <w:keepNext/>
+      </w:pPr>
+      <w:r>
+        <w:rPr>
+          <w:b/>
+          <w:color w:val="1F6FEB"/>
+          <w:sz w:val="22"/>
+        </w:rPr>
+        <w:t>Prerequisites</w:t>
+      </w:r>
+    </w:p>
+    <w:p>
+      <w:pPr>
+        <w:pStyle w:val="ListBullet"/>
+      </w:pPr>
+      <w:r>
+        <w:t>Microsoft 365 account with Copilot available in Word, Excel, PowerPoint and Outlook. Availability depends on the assigned licence and tenant settings; confirm access with the trainer before class.</w:t>
+      </w:r>
+    </w:p>
+    <w:p>
+      <w:pPr>
+        <w:pStyle w:val="ListBullet"/>
+      </w:pPr>
+      <w:r>
+        <w:t>Desktop Excel on Windows or Mac. Download this lab folder and open the files straight from its data folder; save any new file in the same folder. All data is fictional.</w:t>
+      </w:r>
+    </w:p>
+    <w:p>
+      <w:pPr>
+        <w:keepNext/>
+      </w:pPr>
+      <w:r>
+        <w:rPr>
+          <w:b/>
+          <w:color w:val="1F6FEB"/>
+          <w:sz w:val="22"/>
+        </w:rPr>
+        <w:t>Step-by-step</w:t>
+      </w:r>
+    </w:p>
+    <w:p>
+      <w:pPr>
+        <w:spacing w:after="80"/>
+        <w:ind w:left="360"/>
+      </w:pPr>
+      <w:r>
+        <w:rPr>
+          <w:b/>
+        </w:rPr>
+        <w:t xml:space="preserve">1.  </w:t>
+      </w:r>
+      <w:r>
+        <w:t>Look at the plain deck. Open data/Northstar_Plain_Update.pptx in PowerPoint and save it as Northstar_Professional_Update.pptx. The numbers are right, but the slides are plain: black text, no header, no branding.</w:t>
+      </w:r>
+    </w:p>
+    <w:p>
+      <w:pPr>
+        <w:keepNext/>
+        <w:keepLines/>
+      </w:pPr>
+      <w:r>
+        <w:rPr>
+          <w:rFonts w:ascii="Consolas" w:hAnsi="Consolas"/>
+          <w:color w:val="0B3060"/>
+          <w:sz w:val="19"/>
+        </w:rPr>
+        <w:t>Slides : 6</w:t>
+      </w:r>
+    </w:p>
+    <w:p>
+      <w:pPr>
+        <w:keepLines/>
+      </w:pPr>
+      <w:r>
+        <w:rPr>
+          <w:rFonts w:ascii="Consolas" w:hAnsi="Consolas"/>
+          <w:color w:val="0B3060"/>
+          <w:sz w:val="19"/>
+        </w:rPr>
+        <w:t>Look : plain black text, no colours, no header, no footer</w:t>
+      </w:r>
+    </w:p>
+    <w:p>
+      <w:pPr>
+        <w:spacing w:after="80"/>
+        <w:ind w:left="360"/>
+      </w:pPr>
+      <w:r>
+        <w:rPr>
+          <w:b/>
+        </w:rPr>
+        <w:t xml:space="preserve">2.  </w:t>
+      </w:r>
+      <w:r>
+        <w:t>Write the skill. Go to https://copilot.cloud.microsoft, start a new chat, paste the prompt and send it. Read the reply: it starts with --- and the name northstar-deck-design. Copy the whole reply.</w:t>
+      </w:r>
+    </w:p>
+    <w:p>
+      <w:pPr>
+        <w:keepNext/>
+        <w:keepLines/>
+      </w:pPr>
+      <w:r>
+        <w:rPr>
+          <w:rFonts w:ascii="Consolas" w:hAnsi="Consolas"/>
+          <w:color w:val="0B3060"/>
+          <w:sz w:val="19"/>
+        </w:rPr>
+        <w:t>MICROSOFT 365 COPILOT WEB:</w:t>
+      </w:r>
+    </w:p>
+    <w:p>
+      <w:pPr>
+        <w:keepLines/>
+      </w:pPr>
+      <w:r>
+        <w:rPr>
+          <w:rFonts w:ascii="Consolas" w:hAnsi="Consolas"/>
+          <w:color w:val="0B3060"/>
+          <w:sz w:val="19"/>
+        </w:rPr>
+        <w:t>Write a complete SKILL.md for a Copilot in PowerPoint skill named northstar-deck-design. Start with --- front matter: name: northstar-deck-design and description: Use when I ask to make a presentation look professional or apply the Northstar brand. Then write numbered steps: 1) Keep every slide, number and fact; change only the design. 2) Fonts: Segoe UI Semibold for titles, Segoe UI for body text. 3) Colours: navy #1F4E79, blue #2E75B6, teal #2A9D8F, light grey #F2F4F7 cards, white background. 4) Slide 1: navy background, large white title, teal subtitle. 5) Every other slide: a navy header bar with a white title and a thin teal line under it. 6) Turn key numbers into KPI cards with a big bold number and a short label. 7) At most 4 short bullets per slide, with plenty of white space. 8) A footer on every slide except slide 1: Northstar Water Services | 30 September 2026, and the slide number. 9) Check every slide and list anything you could not fix. Return only the SKILL.md text, starting with ---, without code fences.</w:t>
+      </w:r>
+    </w:p>
+    <w:p>
+      <w:pPr>
+        <w:spacing w:after="80"/>
+        <w:ind w:left="360"/>
+      </w:pPr>
+      <w:r>
+        <w:rPr>
+          <w:b/>
+        </w:rPr>
+        <w:t xml:space="preserve">3.  </w:t>
+      </w:r>
+      <w:r>
+        <w:t>Add the skill to PowerPoint. In PowerPoint open Copilot and select + &gt; Choose skills &gt; Manage skills &gt; Add skill. Paste the reply into the form and select Add. Short of time? Open data/templates/northstar-deck-design/SKILL.md in Notepad or TextEdit, copy all of it and paste that instead.</w:t>
+      </w:r>
+    </w:p>
+    <w:p>
+      <w:pPr>
+        <w:keepLines/>
+      </w:pPr>
+      <w:r>
+        <w:rPr>
+          <w:rFonts w:ascii="Consolas" w:hAnsi="Consolas"/>
+          <w:color w:val="0B3060"/>
+          <w:sz w:val="19"/>
+        </w:rPr>
+        <w:t>Check : northstar-deck-design appears when you type @nor</w:t>
+      </w:r>
+    </w:p>
+    <w:p>
+      <w:pPr>
+        <w:spacing w:after="80"/>
+        <w:ind w:left="360"/>
+      </w:pPr>
+      <w:r>
+        <w:rPr>
+          <w:b/>
+        </w:rPr>
+        <w:t xml:space="preserve">4.  </w:t>
+      </w:r>
+      <w:r>
+        <w:t>Transform the deck. Send the prompt and watch every slide change: a navy title slide, a header bar on each slide, KPI cards for the numbers and a footer.</w:t>
+      </w:r>
+    </w:p>
+    <w:p>
+      <w:pPr>
+        <w:keepNext/>
+        <w:keepLines/>
+      </w:pPr>
+      <w:r>
+        <w:rPr>
+          <w:rFonts w:ascii="Consolas" w:hAnsi="Consolas"/>
+          <w:color w:val="0B3060"/>
+          <w:sz w:val="19"/>
+        </w:rPr>
+        <w:t>POWERPOINT COPILOT:</w:t>
+      </w:r>
+    </w:p>
+    <w:p>
+      <w:pPr>
+        <w:keepLines/>
+      </w:pPr>
+      <w:r>
+        <w:rPr>
+          <w:rFonts w:ascii="Consolas" w:hAnsi="Consolas"/>
+          <w:color w:val="0B3060"/>
+          <w:sz w:val="19"/>
+        </w:rPr>
+        <w:t>@northstar-deck-design Redesign this whole deck in the Northstar style. Keep every slide and every number.</w:t>
+      </w:r>
+    </w:p>
+    <w:p>
+      <w:pPr>
+        <w:spacing w:after="80"/>
+        <w:ind w:left="360"/>
+      </w:pPr>
+      <w:r>
+        <w:rPr>
+          <w:b/>
+        </w:rPr>
+        <w:t xml:space="preserve">5.  </w:t>
+      </w:r>
+      <w:r>
+        <w:t>Check the result. Send the prompt and fix anything it lists. The numbers must not change: 120 total, 60 backlog, 50 overdue and 6 unassigned, cost S$35,827.50. Save the deck.</w:t>
+      </w:r>
+    </w:p>
+    <w:p>
+      <w:pPr>
+        <w:keepNext/>
+        <w:keepLines/>
+      </w:pPr>
+      <w:r>
+        <w:rPr>
+          <w:rFonts w:ascii="Consolas" w:hAnsi="Consolas"/>
+          <w:color w:val="0B3060"/>
+          <w:sz w:val="19"/>
+        </w:rPr>
+        <w:t>POWERPOINT COPILOT:</w:t>
+      </w:r>
+    </w:p>
+    <w:p>
+      <w:pPr>
+        <w:keepLines/>
+      </w:pPr>
+      <w:r>
+        <w:rPr>
+          <w:rFonts w:ascii="Consolas" w:hAnsi="Consolas"/>
+          <w:color w:val="0B3060"/>
+          <w:sz w:val="19"/>
+        </w:rPr>
+        <w:t>@northstar-deck-design Check every slide against the skill. List any slide missing the header bar, footer, Northstar fonts or colours, and fix it. Do not change any number.</w:t>
+      </w:r>
+    </w:p>
+    <w:p>
+      <w:pPr>
+        <w:keepNext/>
+      </w:pPr>
+      <w:r>
+        <w:rPr>
+          <w:b/>
+          <w:color w:val="1F6FEB"/>
+          <w:sz w:val="22"/>
+        </w:rPr>
+        <w:t>Test it</w:t>
+      </w:r>
+    </w:p>
+    <w:tbl>
+      <w:tblPr>
+        <w:tblStyle w:val="TableGrid"/>
+        <w:tblW w:type="auto" w:w="0"/>
+        <w:tblLook w:firstColumn="1" w:firstRow="1" w:lastColumn="0" w:lastRow="0" w:noHBand="0" w:noVBand="1" w:val="04A0"/>
+      </w:tblPr>
+      <w:tblGrid>
+        <w:gridCol w:w="4320"/>
+        <w:gridCol w:w="4320"/>
+      </w:tblGrid>
+      <w:tr>
+        <w:trPr>
+          <w:tblHeader w:val="true"/>
+          <w:cantSplit/>
+        </w:trPr>
+        <w:tc>
+          <w:tcPr>
+            <w:tcW w:type="dxa" w:w="4320"/>
+            <w:shd w:val="clear" w:color="auto" w:fill="E8F0FE"/>
+          </w:tcPr>
+          <w:p>
+            <w:pPr>
+              <w:keepNext/>
+            </w:pPr>
+            <w:r/>
+            <w:r>
+              <w:rPr>
+                <w:b/>
+                <w:sz w:val="19"/>
+              </w:rPr>
+              <w:t>Check</w:t>
+            </w:r>
+          </w:p>
+        </w:tc>
+        <w:tc>
+          <w:tcPr>
+            <w:tcW w:type="dxa" w:w="4320"/>
+            <w:shd w:val="clear" w:color="auto" w:fill="E8F0FE"/>
+          </w:tcPr>
+          <w:p>
+            <w:pPr>
+              <w:keepNext/>
+            </w:pPr>
+            <w:r/>
+            <w:r>
+              <w:rPr>
+                <w:b/>
+                <w:sz w:val="19"/>
+              </w:rPr>
+              <w:t>Expected result</w:t>
+            </w:r>
+          </w:p>
+        </w:tc>
+      </w:tr>
+      <w:tr>
+        <w:trPr>
+          <w:cantSplit/>
+        </w:trPr>
+        <w:tc>
+          <w:tcPr>
+            <w:tcW w:type="dxa" w:w="4320"/>
+          </w:tcPr>
+          <w:p>
+            <w:pPr>
+              <w:keepNext/>
+            </w:pPr>
+            <w:r/>
+            <w:r>
+              <w:rPr>
+                <w:sz w:val="19"/>
+              </w:rPr>
+              <w:t>Skill</w:t>
+            </w:r>
+          </w:p>
+        </w:tc>
+        <w:tc>
+          <w:tcPr>
+            <w:tcW w:type="dxa" w:w="4320"/>
+          </w:tcPr>
+          <w:p>
+            <w:pPr>
+              <w:keepNext/>
+            </w:pPr>
+            <w:r/>
+            <w:r>
+              <w:rPr>
+                <w:sz w:val="19"/>
+              </w:rPr>
+              <w:t>northstar-deck-design added in PowerPoint and called with @.</w:t>
+            </w:r>
+          </w:p>
+        </w:tc>
+      </w:tr>
+      <w:tr>
+        <w:trPr>
+          <w:cantSplit/>
+        </w:trPr>
+        <w:tc>
+          <w:tcPr>
+            <w:tcW w:type="dxa" w:w="4320"/>
+          </w:tcPr>
+          <w:p>
+            <w:pPr>
+              <w:keepNext/>
+            </w:pPr>
+            <w:r/>
+            <w:r>
+              <w:rPr>
+                <w:sz w:val="19"/>
+              </w:rPr>
+              <w:t>Design</w:t>
+            </w:r>
+          </w:p>
+        </w:tc>
+        <w:tc>
+          <w:tcPr>
+            <w:tcW w:type="dxa" w:w="4320"/>
+          </w:tcPr>
+          <w:p>
+            <w:pPr>
+              <w:keepNext/>
+            </w:pPr>
+            <w:r/>
+            <w:r>
+              <w:rPr>
+                <w:sz w:val="19"/>
+              </w:rPr>
+              <w:t>Navy title slide; header bar, KPI cards and footer on the other slides; Segoe UI fonts.</w:t>
+            </w:r>
+          </w:p>
+        </w:tc>
+      </w:tr>
+      <w:tr>
+        <w:trPr>
+          <w:cantSplit/>
+        </w:trPr>
+        <w:tc>
+          <w:tcPr>
+            <w:tcW w:type="dxa" w:w="4320"/>
+          </w:tcPr>
+          <w:p>
+            <w:r/>
+            <w:r>
+              <w:rPr>
+                <w:sz w:val="19"/>
+              </w:rPr>
+              <w:t>Facts unchanged</w:t>
+            </w:r>
+          </w:p>
+        </w:tc>
+        <w:tc>
+          <w:tcPr>
+            <w:tcW w:type="dxa" w:w="4320"/>
+          </w:tcPr>
+          <w:p>
+            <w:r/>
+            <w:r>
+              <w:rPr>
+                <w:sz w:val="19"/>
+              </w:rPr>
+              <w:t>6 slides; 120 total, 60 backlog, 50 overdue and 6 unassigned; S$35,827.50.</w:t>
+            </w:r>
+          </w:p>
+        </w:tc>
+      </w:tr>
+    </w:tbl>
+    <w:p/>
+    <w:p>
+      <w:pPr>
+        <w:keepNext/>
+      </w:pPr>
+      <w:r>
+        <w:rPr>
+          <w:b/>
+          <w:color w:val="1F6FEB"/>
+          <w:sz w:val="22"/>
+        </w:rPr>
+        <w:t>Troubleshooting</w:t>
+      </w:r>
+    </w:p>
+    <w:tbl>
+      <w:tblPr>
+        <w:tblStyle w:val="TableGrid"/>
+        <w:tblW w:type="auto" w:w="0"/>
+        <w:tblLook w:firstColumn="1" w:firstRow="1" w:lastColumn="0" w:lastRow="0" w:noHBand="0" w:noVBand="1" w:val="04A0"/>
+      </w:tblPr>
+      <w:tblGrid>
+        <w:gridCol w:w="4320"/>
+        <w:gridCol w:w="4320"/>
+      </w:tblGrid>
+      <w:tr>
+        <w:trPr>
+          <w:tblHeader w:val="true"/>
+          <w:cantSplit/>
+        </w:trPr>
+        <w:tc>
+          <w:tcPr>
+            <w:tcW w:type="dxa" w:w="4320"/>
+            <w:shd w:val="clear" w:color="auto" w:fill="E8F0FE"/>
+          </w:tcPr>
+          <w:p>
+            <w:pPr>
+              <w:keepNext/>
+            </w:pPr>
+            <w:r/>
+            <w:r>
+              <w:rPr>
+                <w:b/>
+                <w:sz w:val="19"/>
+              </w:rPr>
+              <w:t>If this happens</w:t>
+            </w:r>
+          </w:p>
+        </w:tc>
+        <w:tc>
+          <w:tcPr>
+            <w:tcW w:type="dxa" w:w="4320"/>
+            <w:shd w:val="clear" w:color="auto" w:fill="E8F0FE"/>
+          </w:tcPr>
+          <w:p>
+            <w:pPr>
+              <w:keepNext/>
+            </w:pPr>
+            <w:r/>
+            <w:r>
+              <w:rPr>
+                <w:b/>
+                <w:sz w:val="19"/>
+              </w:rPr>
+              <w:t>Fix</w:t>
+            </w:r>
+          </w:p>
+        </w:tc>
+      </w:tr>
+      <w:tr>
+        <w:trPr>
+          <w:cantSplit/>
+        </w:trPr>
+        <w:tc>
+          <w:tcPr>
+            <w:tcW w:type="dxa" w:w="4320"/>
+          </w:tcPr>
+          <w:p>
+            <w:pPr>
+              <w:keepNext/>
+            </w:pPr>
+            <w:r/>
+            <w:r>
+              <w:rPr>
+                <w:sz w:val="19"/>
+              </w:rPr>
+              <w:t>Copilot cannot see my file</w:t>
+            </w:r>
+          </w:p>
+        </w:tc>
+        <w:tc>
+          <w:tcPr>
+            <w:tcW w:type="dxa" w:w="4320"/>
+          </w:tcPr>
+          <w:p>
+            <w:pPr>
+              <w:keepNext/>
+            </w:pPr>
+            <w:r/>
+            <w:r>
+              <w:rPr>
+                <w:sz w:val="19"/>
+              </w:rPr>
+              <w:t>In Excel, save the file and open Copilot again. In Word, PowerPoint or Outlook, upload the file with + &gt; Upload images and files, and upload it again after you change it.</w:t>
+            </w:r>
+          </w:p>
+        </w:tc>
+      </w:tr>
+      <w:tr>
+        <w:trPr>
+          <w:cantSplit/>
+        </w:trPr>
+        <w:tc>
+          <w:tcPr>
+            <w:tcW w:type="dxa" w:w="4320"/>
+          </w:tcPr>
+          <w:p>
+            <w:pPr>
+              <w:keepNext/>
+            </w:pPr>
+            <w:r/>
+            <w:r>
+              <w:rPr>
+                <w:sz w:val="19"/>
+              </w:rPr>
+              <w:t>A number is different from the lab</w:t>
+            </w:r>
+          </w:p>
+        </w:tc>
+        <w:tc>
+          <w:tcPr>
+            <w:tcW w:type="dxa" w:w="4320"/>
+          </w:tcPr>
+          <w:p>
+            <w:pPr>
+              <w:keepNext/>
+            </w:pPr>
+            <w:r/>
+            <w:r>
+              <w:rPr>
+                <w:sz w:val="19"/>
+              </w:rPr>
+              <w:t>Clear any slicers or filters, check the table has no extra rows, then ask again in a new chat.</w:t>
+            </w:r>
+          </w:p>
+        </w:tc>
+      </w:tr>
+      <w:tr>
+        <w:trPr>
+          <w:cantSplit/>
+        </w:trPr>
+        <w:tc>
+          <w:tcPr>
+            <w:tcW w:type="dxa" w:w="4320"/>
+          </w:tcPr>
+          <w:p>
+            <w:r/>
+            <w:r>
+              <w:rPr>
+                <w:sz w:val="19"/>
+              </w:rPr>
+              <w:t>A button or feature is missing</w:t>
+            </w:r>
+          </w:p>
+        </w:tc>
+        <w:tc>
+          <w:tcPr>
+            <w:tcW w:type="dxa" w:w="4320"/>
+          </w:tcPr>
+          <w:p>
+            <w:r/>
+            <w:r>
+              <w:rPr>
+                <w:sz w:val="19"/>
+              </w:rPr>
+              <w:t>Check you are signed in with your course account and Microsoft 365 is up to date, then tell your trainer.</w:t>
+            </w:r>
+          </w:p>
+        </w:tc>
+      </w:tr>
+    </w:tbl>
+    <w:p/>
+    <w:p>
+      <w:pPr>
+        <w:keepNext/>
+      </w:pPr>
+      <w:r>
+        <w:rPr>
+          <w:b/>
+          <w:color w:val="1F6FEB"/>
+          <w:sz w:val="22"/>
+        </w:rPr>
+        <w:t>Challenge</w:t>
+      </w:r>
+    </w:p>
+    <w:p>
+      <w:pPr>
+        <w:keepNext/>
+      </w:pPr>
+      <w:r>
+        <w:t>Add a reference file such as brand-colours.md to the skill folder in OneDrive, mention it in SKILL.md, and apply the skill to a plain deck of your own.</w:t>
+      </w:r>
+    </w:p>
+    <w:p>
+      <w:pPr>
+        <w:keepNext/>
+      </w:pPr>
+      <w:r>
+        <w:rPr>
+          <w:b/>
+          <w:color w:val="1F6FEB"/>
+          <w:sz w:val="22"/>
+        </w:rPr>
+        <w:t>Reflection</w:t>
+      </w:r>
+    </w:p>
+    <w:p>
+      <w:r>
+        <w:t>Which evidence proves the output is correct, and which decision still needs a person?</w:t>
+      </w:r>
+    </w:p>
+    <w:p>
+      <w:r>
+        <w:rPr>
+          <w:b/>
+          <w:color w:val="1F6FEB"/>
+        </w:rPr>
+        <w:t xml:space="preserve">Note: </w:t>
+      </w:r>
+      <w:r>
+        <w:rPr>
+          <w:sz w:val="20"/>
+        </w:rPr>
+        <w:t>The lab folder labs/lab-07-*/ holds the instruction PDF with sample prompts, a data folder with the lab workbook and any templates (data/Northstar_Plain_Update.pptx). Northstar Water Services is a fictional water-pipe maintenance and service company. All service hubs, staff and work orders are synthetic. Use the fixed reporting date 2026-09-30; missing facts remain UNKNOWN. Proposals do not change real assignments. Training email drafts are never sent.</w:t>
       </w:r>
     </w:p>
     <w:p/>
@@ -10454,7 +11715,7 @@
     </w:p>
     <w:p>
       <w:r>
-        <w:t>Concepts for Lab 7: Custom Dashboard Skill as a Reusable Contract, Dashboard Measures and Denominators, Visual Dashboard Design for Maintenance.</w:t>
+        <w:t>Concepts for Lab 8: Custom Dashboard Skill as a Reusable Contract, Dashboard Measures and Denominators, Visual Dashboard Design for Maintenance.</w:t>
       </w:r>
     </w:p>
     <w:p>
@@ -11155,7 +12416,7 @@
         <w:keepNext/>
       </w:pPr>
       <w:r>
-        <w:t>Lab 7 · Custom Dashboard Skill — Create and Apply a Custom Interactive Dashboard Skill</w:t>
+        <w:t>Lab 8 · Custom Dashboard Skill — Build an Interactive Dashboard with a Custom Skill</w:t>
       </w:r>
     </w:p>
     <w:p>
@@ -11282,7 +12543,7 @@
         <w:t xml:space="preserve">2.  </w:t>
       </w:r>
       <w:r>
-        <w:t>Turn the skill on. Back in Excel select Settings (...) &gt; Manage plugins &amp; skills &gt; Custom skills &gt; Refresh, then turn water-service-dashboard on. Close the dialog and type @wat in the Copilot prompt box: water-service-dashboard should appear. If it does not, wait a minute and select Refresh again.</w:t>
+        <w:t>Turn the skill on. Back in Excel select Settings (...) &gt; Manage plugins &amp; skills &gt; Custom skills &gt; Refresh, then turn water-service-dashboard on. Close the dialog and type @wat in the Copilot prompt box: water-service-dashboard should appear. If not, wait a minute and select Refresh again.</w:t>
       </w:r>
     </w:p>
     <w:p>
@@ -11295,7 +12556,7 @@
           <w:color w:val="0B3060"/>
           <w:sz w:val="19"/>
         </w:rPr>
-        <w:t>Check : water-service-dashboard appears when you type @wat</w:t>
+        <w:t>Check : water-service-dashboard appears when you type @</w:t>
       </w:r>
     </w:p>
     <w:p>
@@ -11877,13 +13138,13 @@
         <w:rPr>
           <w:sz w:val="20"/>
         </w:rPr>
-        <w:t>The lab folder labs/lab-07-*/ holds the instruction PDF with sample prompts, a data folder with the lab workbook and any templates (data/Northstar_Work_Orders.xlsx), plus data/templates/water-service-dashboard/SKILL.md (Reviewed interactive dashboard Skill fallback). Northstar Water Services is a fictional water-pipe maintenance and service company. All service hubs, staff and work orders are synthetic. Use the fixed reporting date 2026-09-30; missing facts remain UNKNOWN. Proposals do not change real assignments. Training email drafts are never sent.</w:t>
+        <w:t>The lab folder labs/lab-08-*/ holds the instruction PDF with sample prompts, a data folder with the lab workbook and any templates (data/Northstar_Work_Orders.xlsx), plus data/templates/water-service-dashboard/SKILL.md (Reviewed interactive dashboard Skill fallback). Northstar Water Services is a fictional water-pipe maintenance and service company. All service hubs, staff and work orders are synthetic. Use the fixed reporting date 2026-09-30; missing facts remain UNKNOWN. Proposals do not change real assignments. Training email drafts are never sent.</w:t>
       </w:r>
     </w:p>
     <w:p/>
     <w:p>
       <w:r>
-        <w:t>Concepts for Lab 8: One Filter Scope for Every Visual, Refresh Tests and Static Snapshots.</w:t>
+        <w:t>Concepts for Lab 9: One Filter Scope for Every Visual, Refresh Tests and Static Snapshots.</w:t>
       </w:r>
     </w:p>
     <w:p>
@@ -12356,7 +13617,7 @@
         <w:keepNext/>
       </w:pPr>
       <w:r>
-        <w:t>Lab 8 · Interactive Filters and Refresh — Test Dashboard Filters and a Data Refresh</w:t>
+        <w:t>Lab 9 · Interactive Filters and Refresh — Test Dashboard Filters and a Data Refresh</w:t>
       </w:r>
     </w:p>
     <w:p>
@@ -13162,7 +14423,7 @@
         <w:rPr>
           <w:sz w:val="20"/>
         </w:rPr>
-        <w:t>The lab folder labs/lab-08-*/ holds the instruction PDF with sample prompts, a data folder with the lab workbook and any templates (data/Northstar_Work_Orders.xlsx), plus data/templates/water-service-dashboard/SKILL.md (Reviewed dashboard Skill for reruns). Northstar Water Services is a fictional water-pipe maintenance and service company. All service hubs, staff and work orders are synthetic. Use the fixed reporting date 2026-09-30; missing facts remain UNKNOWN. Proposals do not change real assignments. Training email drafts are never sent.</w:t>
+        <w:t>The lab folder labs/lab-09-*/ holds the instruction PDF with sample prompts, a data folder with the lab workbook and any templates (data/Northstar_Work_Orders.xlsx), plus data/templates/water-service-dashboard/SKILL.md (Reviewed dashboard Skill for reruns). Northstar Water Services is a fictional water-pipe maintenance and service company. All service hubs, staff and work orders are synthetic. Use the fixed reporting date 2026-09-30; missing facts remain UNKNOWN. Proposals do not change real assignments. Training email drafts are never sent.</w:t>
       </w:r>
     </w:p>
     <w:p/>
@@ -13376,7 +14637,7 @@
     </w:p>
     <w:p>
       <w:r>
-        <w:t>Concepts for Lab 9: From Dashboard Evidence to a Decision Story, Charts, Templates and Source Provenance.</w:t>
+        <w:t>Concepts for Lab 10: From Dashboard Evidence to a Decision Story, Charts, Templates and Source Provenance.</w:t>
       </w:r>
     </w:p>
     <w:p>
@@ -13865,7 +15126,7 @@
         <w:keepNext/>
       </w:pPr>
       <w:r>
-        <w:t>Lab 9 · Dashboard to presentation — Turn Dashboard Evidence into a Management Story</w:t>
+        <w:t>Lab 10 · Dashboard to presentation — Turn Dashboard Evidence into a Management Story</w:t>
       </w:r>
     </w:p>
     <w:p>
@@ -14531,13 +15792,13 @@
         <w:rPr>
           <w:sz w:val="20"/>
         </w:rPr>
-        <w:t>The lab folder labs/lab-09-*/ holds the instruction PDF with sample prompts, a data folder with the lab workbook and any templates (data/Northstar_Work_Orders.xlsx). Northstar Water Services is a fictional water-pipe maintenance and service company. All service hubs, staff and work orders are synthetic. Use the fixed reporting date 2026-09-30; missing facts remain UNKNOWN. Proposals do not change real assignments. Training email drafts are never sent.</w:t>
+        <w:t>The lab folder labs/lab-10-*/ holds the instruction PDF with sample prompts, a data folder with the lab workbook and any templates (data/Northstar_Work_Orders.xlsx). Northstar Water Services is a fictional water-pipe maintenance and service company. All service hubs, staff and work orders are synthetic. Use the fixed reporting date 2026-09-30; missing facts remain UNKNOWN. Proposals do not change real assignments. Training email drafts are never sent.</w:t>
       </w:r>
     </w:p>
     <w:p/>
     <w:p>
       <w:r>
-        <w:t>Concepts for Lab 10: Professional Refinement and Rehearsal, Reviewed Handoff and Artifact Lifecycle.</w:t>
+        <w:t>Concepts for Lab 11: Professional Refinement and Rehearsal, Reviewed Handoff and Artifact Lifecycle.</w:t>
       </w:r>
     </w:p>
     <w:p>
@@ -15010,7 +16271,7 @@
         <w:keepNext/>
       </w:pPr>
       <w:r>
-        <w:t>Lab 10 · Professional handoff — Refine and Present the Maintenance Decision Deck</w:t>
+        <w:t>Lab 11 · Professional handoff — Refine and Present the Maintenance Decision Deck</w:t>
       </w:r>
     </w:p>
     <w:p>
@@ -15690,7 +16951,7 @@
         <w:rPr>
           <w:sz w:val="20"/>
         </w:rPr>
-        <w:t>The lab folder labs/lab-10-*/ holds the instruction PDF with sample prompts, a data folder with the lab workbook and any templates (data/Northstar_Work_Orders.xlsx). Northstar Water Services is a fictional water-pipe maintenance and service company. All service hubs, staff and work orders are synthetic. Use the fixed reporting date 2026-09-30; missing facts remain UNKNOWN. Proposals do not change real assignments. Training email drafts are never sent.</w:t>
+        <w:t>The lab folder labs/lab-11-*/ holds the instruction PDF with sample prompts, a data folder with the lab workbook and any templates (data/Northstar_Work_Orders.xlsx). Northstar Water Services is a fictional water-pipe maintenance and service company. All service hubs, staff and work orders are synthetic. Use the fixed reporting date 2026-09-30; missing facts remain UNKNOWN. Proposals do not change real assignments. Training email drafts are never sent.</w:t>
       </w:r>
     </w:p>
     <w:p/>
@@ -15904,7 +17165,7 @@
     </w:p>
     <w:p>
       <w:r>
-        <w:t>Concepts for Lab 11: What Is Agent Builder?.</w:t>
+        <w:t>Concepts for Lab 12: What Is Agent Builder?.</w:t>
       </w:r>
     </w:p>
     <w:p>
@@ -16157,7 +17418,7 @@
         <w:keepNext/>
       </w:pPr>
       <w:r>
-        <w:t>Lab 11 · Copilot Agent Builder — Build a Work-Order Agent with Agent Builder</w:t>
+        <w:t>Lab 12 · Copilot Agent Builder — Build a Work-Order Agent with Agent Builder</w:t>
       </w:r>
     </w:p>
     <w:p>
@@ -16694,27 +17955,6 @@
           <w:color w:val="1F6FEB"/>
           <w:sz w:val="22"/>
         </w:rPr>
-        <w:t>If you get stuck</w:t>
-      </w:r>
-    </w:p>
-    <w:p>
-      <w:pPr>
-        <w:keepNext/>
-      </w:pPr>
-      <w:r>
-        <w:t>If Agent Builder is unavailable in your tenant, watch the trainer demonstration and practise the same instructions, knowledge and test prompts in Microsoft Copilot Chat with both files attached from this lab’s data/knowledge folder; record the route used.</w:t>
-      </w:r>
-    </w:p>
-    <w:p>
-      <w:pPr>
-        <w:keepNext/>
-      </w:pPr>
-      <w:r>
-        <w:rPr>
-          <w:b/>
-          <w:color w:val="1F6FEB"/>
-          <w:sz w:val="22"/>
-        </w:rPr>
         <w:t>Troubleshooting</w:t>
       </w:r>
     </w:p>
@@ -16936,13 +18176,13 @@
         <w:rPr>
           <w:sz w:val="20"/>
         </w:rPr>
-        <w:t>The lab folder labs/lab-11-*/ holds the instruction PDF with sample prompts, a data folder with the lab workbook and any templates (data/knowledge/Northstar_Service_Handbook.docx, data/knowledge/Northstar_Work_Orders_Clean.xlsx). Northstar Water Services is a fictional water-pipe maintenance and service company. All service hubs, staff and work orders are synthetic. Use the fixed reporting date 2026-09-30; missing facts remain UNKNOWN. Proposals do not change real assignments. Training email drafts are never sent.</w:t>
+        <w:t>The lab folder labs/lab-12-*/ holds the instruction PDF with sample prompts, a data folder with the lab workbook and any templates (data/knowledge/Northstar_Service_Handbook.docx, data/knowledge/Northstar_Work_Orders_Clean.xlsx). Northstar Water Services is a fictional water-pipe maintenance and service company. All service hubs, staff and work orders are synthetic. Use the fixed reporting date 2026-09-30; missing facts remain UNKNOWN. Proposals do not change real assignments. Training email drafts are never sent.</w:t>
       </w:r>
     </w:p>
     <w:p/>
     <w:p>
       <w:r>
-        <w:t>Concepts for Lab 12: Mini Capstone: From Your Data to a Decision.</w:t>
+        <w:t>Concepts for Lab 13: Mini Capstone: From Your Data to a Decision.</w:t>
       </w:r>
     </w:p>
     <w:p>
@@ -17195,7 +18435,7 @@
         <w:keepNext/>
       </w:pPr>
       <w:r>
-        <w:t>Lab 12 · Mini Capstone — Mini Capstone: Group Dashboard and Decision Deck</w:t>
+        <w:t>Lab 13 · Mini Capstone — Mini Capstone: Group Dashboard and Decision Deck</w:t>
       </w:r>
     </w:p>
     <w:p>
@@ -17755,27 +18995,6 @@
           <w:color w:val="1F6FEB"/>
           <w:sz w:val="22"/>
         </w:rPr>
-        <w:t>If you get stuck</w:t>
-      </w:r>
-    </w:p>
-    <w:p>
-      <w:pPr>
-        <w:keepNext/>
-      </w:pPr>
-      <w:r>
-        <w:t>Short of time? Present the Lab 8 Northstar dashboard and your Lab 10 deck instead, and say so in the showcase.</w:t>
-      </w:r>
-    </w:p>
-    <w:p>
-      <w:pPr>
-        <w:keepNext/>
-      </w:pPr>
-      <w:r>
-        <w:rPr>
-          <w:b/>
-          <w:color w:val="1F6FEB"/>
-          <w:sz w:val="22"/>
-        </w:rPr>
         <w:t>Troubleshooting</w:t>
       </w:r>
     </w:p>
@@ -17997,7 +19216,7 @@
         <w:rPr>
           <w:sz w:val="20"/>
         </w:rPr>
-        <w:t>The lab folder labs/lab-12-*/ holds the instruction PDF with sample prompts, a data folder with the lab workbook and any templates (Your own mock or sanitised dataset). Northstar Water Services is a fictional water-pipe maintenance and service company. All service hubs, staff and work orders are synthetic. Use the fixed reporting date 2026-09-30; missing facts remain UNKNOWN. Proposals do not change real assignments. Training email drafts are never sent.</w:t>
+        <w:t>The lab folder labs/lab-13-*/ holds the instruction PDF with sample prompts, a data folder with the lab workbook and any templates (Your own mock or sanitised dataset). Northstar Water Services is a fictional water-pipe maintenance and service company. All service hubs, staff and work orders are synthetic. Use the fixed reporting date 2026-09-30; missing facts remain UNKNOWN. Proposals do not change real assignments. Training email drafts are never sent.</w:t>
       </w:r>
     </w:p>
     <w:p/>

</xml_diff>